<commit_message>
Day 2 on the simple GreenWaste case: Oct13 S1, S2 and S3
- S1 (DiD): the rest of the city, after * took_part with errors clustered by
  business (-813). New slide: the pilot's waiting businesses rose 372 against
  144, so parallel trends fails; with them as the comparison DiD gives -1,042.
- S2 (RDD): Module 1 recap and the pooling slide removed; city jump -656 at
  +/-2, -554 adjusting for manager age; checks recomputed; check 4 compares
  the line with the lottery (-1,014). Jump cards A-H redrawn from the city.
- S3 (matching): nearest neighbour on manager age, staff, premises and
  filtration (-1,031). The camera case is replaced by two evaluators on one
  dataset (B never measured manager age: -1,342).
- _case_map.qmd: the city map, included as the opening slide of each deck.
- Packs for the three sessions rebuilt from greenwaste_case.R.

Co-Authored-By: Claude Opus 5.5 <noreply@anthropic.com>
</commit_message>
<xml_diff>
--- a/Module_2_Oct_2026_v2/Oct13_session1_materials.docx
+++ b/Module_2_Oct_2026_v2/Oct13_session1_materials.docx
@@ -21,6 +21,7 @@
           <w:i w:val="false"/>
           <w:b w:val="false"/>
           <w:u w:val="none"/>
+          <w:strike w:val="false"/>
           <w:sz w:val="18"/>
           <w:szCs w:val="18"/>
           <w:color w:val="545860"/>
@@ -47,6 +48,7 @@
           <w:i w:val="false"/>
           <w:b w:val="true"/>
           <w:u w:val="none"/>
+          <w:strike w:val="false"/>
           <w:sz w:val="36"/>
           <w:szCs w:val="36"/>
           <w:color w:val="063360"/>
@@ -73,6 +75,7 @@
           <w:i w:val="true"/>
           <w:b w:val="false"/>
           <w:u w:val="none"/>
+          <w:strike w:val="false"/>
           <w:sz w:val="18"/>
           <w:szCs w:val="18"/>
           <w:color w:val="215A9E"/>
@@ -99,11 +102,12 @@
           <w:i w:val="false"/>
           <w:b w:val="false"/>
           <w:u w:val="none"/>
+          <w:strike w:val="false"/>
           <w:sz w:val="22"/>
           <w:szCs w:val="22"/>
           <w:color w:val="000000"/>
         </w:rPr>
-        <w:t xml:space="preserve">GreenWaste businesses in the neighbourhoods where the programme was offered. Average annual waste-management costs (AED), before and after. The decision rule for scale-up: the programme must save at least 1,000 AED per business.</w:t>
+        <w:t xml:space="preserve">GreenWaste businesses in the rest of the city: those scoring 58 or below took part, the rest did not. Average annual waste costs (AED), before and after. The decision rule for scale-up: the programme must save at least 1,000 AED per business.</w:t>
       </w:r>
     </w:p>
     <w:tbl xmlns:a="http://schemas.openxmlformats.org/drawingml/2006/main" xmlns:pic="http://schemas.openxmlformats.org/drawingml/2006/picture">
@@ -143,7 +147,6 @@
           </w:tcPr>
           <w:p>
             <w:pPr>
-              <w:pStyle w:val="Normal"/>
               <w:jc w:val="left"/>
               <w:pBdr>
                 <w:bottom w:val="none" w:sz="0" w:space="0" w:color="000000"/>
@@ -153,13 +156,24 @@
               </w:pBdr>
               <w:spacing w:after="80" w:before="80" w:line="240"/>
               <w:ind w:left="80" w:right="80" w:firstLine="0" w:firstLineChars="0"/>
+              <w:rPr>
+                <w:rFonts w:ascii="Arial" w:hAnsi="Arial" w:eastAsia="Arial" w:cs="Arial"/>
+                <w:i w:val="false"/>
+                <w:b w:val="true"/>
+                <w:u w:val="none"/>
+                <w:strike w:val="false"/>
+                <w:sz w:val="21"/>
+                <w:szCs w:val="21"/>
+                <w:color w:val="063360"/>
+              </w:rPr>
             </w:pPr>
             <w:r>
               <w:rPr>
-                <w:rFonts w:ascii="Arial" w:hAnsi="DejaVu Sans" w:eastAsia="DejaVu Sans" w:cs="DejaVu Sans"/>
+                <w:rFonts w:ascii="Arial" w:hAnsi="Arial" w:eastAsia="Arial" w:cs="Arial"/>
                 <w:i w:val="false"/>
                 <w:b w:val="true"/>
                 <w:u w:val="none"/>
+                <w:strike w:val="false"/>
                 <w:sz w:val="21"/>
                 <w:szCs w:val="21"/>
                 <w:color w:val="063360"/>
@@ -187,7 +201,6 @@
           </w:tcPr>
           <w:p>
             <w:pPr>
-              <w:pStyle w:val="Normal"/>
               <w:jc w:val="left"/>
               <w:pBdr>
                 <w:bottom w:val="none" w:sz="0" w:space="0" w:color="000000"/>
@@ -197,13 +210,24 @@
               </w:pBdr>
               <w:spacing w:after="80" w:before="80" w:line="240"/>
               <w:ind w:left="80" w:right="80" w:firstLine="0" w:firstLineChars="0"/>
+              <w:rPr>
+                <w:rFonts w:ascii="Arial" w:hAnsi="Arial" w:eastAsia="Arial" w:cs="Arial"/>
+                <w:i w:val="false"/>
+                <w:b w:val="true"/>
+                <w:u w:val="none"/>
+                <w:strike w:val="false"/>
+                <w:sz w:val="21"/>
+                <w:szCs w:val="21"/>
+                <w:color w:val="063360"/>
+              </w:rPr>
             </w:pPr>
             <w:r>
               <w:rPr>
-                <w:rFonts w:ascii="Arial" w:hAnsi="DejaVu Sans" w:eastAsia="DejaVu Sans" w:cs="DejaVu Sans"/>
+                <w:rFonts w:ascii="Arial" w:hAnsi="Arial" w:eastAsia="Arial" w:cs="Arial"/>
                 <w:i w:val="false"/>
                 <w:b w:val="true"/>
                 <w:u w:val="none"/>
+                <w:strike w:val="false"/>
                 <w:sz w:val="21"/>
                 <w:szCs w:val="21"/>
                 <w:color w:val="063360"/>
@@ -231,7 +255,6 @@
           </w:tcPr>
           <w:p>
             <w:pPr>
-              <w:pStyle w:val="Normal"/>
               <w:jc w:val="left"/>
               <w:pBdr>
                 <w:bottom w:val="none" w:sz="0" w:space="0" w:color="000000"/>
@@ -241,13 +264,24 @@
               </w:pBdr>
               <w:spacing w:after="80" w:before="80" w:line="240"/>
               <w:ind w:left="80" w:right="80" w:firstLine="0" w:firstLineChars="0"/>
+              <w:rPr>
+                <w:rFonts w:ascii="Arial" w:hAnsi="Arial" w:eastAsia="Arial" w:cs="Arial"/>
+                <w:i w:val="false"/>
+                <w:b w:val="true"/>
+                <w:u w:val="none"/>
+                <w:strike w:val="false"/>
+                <w:sz w:val="21"/>
+                <w:szCs w:val="21"/>
+                <w:color w:val="063360"/>
+              </w:rPr>
             </w:pPr>
             <w:r>
               <w:rPr>
-                <w:rFonts w:ascii="Arial" w:hAnsi="DejaVu Sans" w:eastAsia="DejaVu Sans" w:cs="DejaVu Sans"/>
+                <w:rFonts w:ascii="Arial" w:hAnsi="Arial" w:eastAsia="Arial" w:cs="Arial"/>
                 <w:i w:val="false"/>
                 <w:b w:val="true"/>
                 <w:u w:val="none"/>
+                <w:strike w:val="false"/>
                 <w:sz w:val="21"/>
                 <w:szCs w:val="21"/>
                 <w:color w:val="063360"/>
@@ -275,7 +309,6 @@
           </w:tcPr>
           <w:p>
             <w:pPr>
-              <w:pStyle w:val="Normal"/>
               <w:jc w:val="left"/>
               <w:pBdr>
                 <w:bottom w:val="none" w:sz="0" w:space="0" w:color="000000"/>
@@ -285,13 +318,24 @@
               </w:pBdr>
               <w:spacing w:after="80" w:before="80" w:line="240"/>
               <w:ind w:left="80" w:right="80" w:firstLine="0" w:firstLineChars="0"/>
+              <w:rPr>
+                <w:rFonts w:ascii="Arial" w:hAnsi="Arial" w:eastAsia="Arial" w:cs="Arial"/>
+                <w:i w:val="false"/>
+                <w:b w:val="true"/>
+                <w:u w:val="none"/>
+                <w:strike w:val="false"/>
+                <w:sz w:val="21"/>
+                <w:szCs w:val="21"/>
+                <w:color w:val="063360"/>
+              </w:rPr>
             </w:pPr>
             <w:r>
               <w:rPr>
-                <w:rFonts w:ascii="Arial" w:hAnsi="DejaVu Sans" w:eastAsia="DejaVu Sans" w:cs="DejaVu Sans"/>
+                <w:rFonts w:ascii="Arial" w:hAnsi="Arial" w:eastAsia="Arial" w:cs="Arial"/>
                 <w:i w:val="false"/>
                 <w:b w:val="true"/>
                 <w:u w:val="none"/>
+                <w:strike w:val="false"/>
                 <w:sz w:val="21"/>
                 <w:szCs w:val="21"/>
                 <w:color w:val="063360"/>
@@ -325,7 +369,6 @@
           </w:tcPr>
           <w:p>
             <w:pPr>
-              <w:pStyle w:val="Normal"/>
               <w:jc w:val="left"/>
               <w:pBdr>
                 <w:bottom w:val="none" w:sz="0" w:space="0" w:color="000000"/>
@@ -335,13 +378,24 @@
               </w:pBdr>
               <w:spacing w:after="80" w:before="80" w:line="240"/>
               <w:ind w:left="80" w:right="80" w:firstLine="0" w:firstLineChars="0"/>
+              <w:rPr>
+                <w:rFonts w:ascii="Arial" w:hAnsi="Arial" w:eastAsia="Arial" w:cs="Arial"/>
+                <w:i w:val="false"/>
+                <w:b w:val="false"/>
+                <w:u w:val="none"/>
+                <w:strike w:val="false"/>
+                <w:sz w:val="21"/>
+                <w:szCs w:val="21"/>
+                <w:color w:val="000000"/>
+              </w:rPr>
             </w:pPr>
             <w:r>
               <w:rPr>
-                <w:rFonts w:ascii="Arial" w:hAnsi="DejaVu Sans" w:eastAsia="DejaVu Sans" w:cs="DejaVu Sans"/>
-                <w:i w:val="false"/>
-                <w:b w:val="false"/>
-                <w:u w:val="none"/>
+                <w:rFonts w:ascii="Arial" w:hAnsi="Arial" w:eastAsia="Arial" w:cs="Arial"/>
+                <w:i w:val="false"/>
+                <w:b w:val="false"/>
+                <w:u w:val="none"/>
+                <w:strike w:val="false"/>
                 <w:sz w:val="21"/>
                 <w:szCs w:val="21"/>
                 <w:color w:val="000000"/>
@@ -369,7 +423,6 @@
           </w:tcPr>
           <w:p>
             <w:pPr>
-              <w:pStyle w:val="Normal"/>
               <w:jc w:val="left"/>
               <w:pBdr>
                 <w:bottom w:val="none" w:sz="0" w:space="0" w:color="000000"/>
@@ -379,18 +432,29 @@
               </w:pBdr>
               <w:spacing w:after="80" w:before="80" w:line="240"/>
               <w:ind w:left="80" w:right="80" w:firstLine="0" w:firstLineChars="0"/>
+              <w:rPr>
+                <w:rFonts w:ascii="Arial" w:hAnsi="Arial" w:eastAsia="Arial" w:cs="Arial"/>
+                <w:i w:val="false"/>
+                <w:b w:val="false"/>
+                <w:u w:val="none"/>
+                <w:strike w:val="false"/>
+                <w:sz w:val="21"/>
+                <w:szCs w:val="21"/>
+                <w:color w:val="000000"/>
+              </w:rPr>
             </w:pPr>
             <w:r>
               <w:rPr>
-                <w:rFonts w:ascii="Arial" w:hAnsi="DejaVu Sans" w:eastAsia="DejaVu Sans" w:cs="DejaVu Sans"/>
-                <w:i w:val="false"/>
-                <w:b w:val="false"/>
-                <w:u w:val="none"/>
-                <w:sz w:val="21"/>
-                <w:szCs w:val="21"/>
-                <w:color w:val="000000"/>
-              </w:rPr>
-              <w:t xml:space="preserve">1,449</w:t>
+                <w:rFonts w:ascii="Arial" w:hAnsi="Arial" w:eastAsia="Arial" w:cs="Arial"/>
+                <w:i w:val="false"/>
+                <w:b w:val="false"/>
+                <w:u w:val="none"/>
+                <w:strike w:val="false"/>
+                <w:sz w:val="21"/>
+                <w:szCs w:val="21"/>
+                <w:color w:val="000000"/>
+              </w:rPr>
+              <w:t xml:space="preserve">1,432</w:t>
             </w:r>
           </w:p>
         </w:tc>
@@ -413,7 +477,6 @@
           </w:tcPr>
           <w:p>
             <w:pPr>
-              <w:pStyle w:val="Normal"/>
               <w:jc w:val="left"/>
               <w:pBdr>
                 <w:bottom w:val="none" w:sz="0" w:space="0" w:color="000000"/>
@@ -423,18 +486,29 @@
               </w:pBdr>
               <w:spacing w:after="80" w:before="80" w:line="240"/>
               <w:ind w:left="80" w:right="80" w:firstLine="0" w:firstLineChars="0"/>
+              <w:rPr>
+                <w:rFonts w:ascii="Arial" w:hAnsi="Arial" w:eastAsia="Arial" w:cs="Arial"/>
+                <w:i w:val="false"/>
+                <w:b w:val="false"/>
+                <w:u w:val="none"/>
+                <w:strike w:val="false"/>
+                <w:sz w:val="21"/>
+                <w:szCs w:val="21"/>
+                <w:color w:val="000000"/>
+              </w:rPr>
             </w:pPr>
             <w:r>
               <w:rPr>
-                <w:rFonts w:ascii="Arial" w:hAnsi="DejaVu Sans" w:eastAsia="DejaVu Sans" w:cs="DejaVu Sans"/>
-                <w:i w:val="false"/>
-                <w:b w:val="false"/>
-                <w:u w:val="none"/>
-                <w:sz w:val="21"/>
-                <w:szCs w:val="21"/>
-                <w:color w:val="000000"/>
-              </w:rPr>
-              <w:t xml:space="preserve">784</w:t>
+                <w:rFonts w:ascii="Arial" w:hAnsi="Arial" w:eastAsia="Arial" w:cs="Arial"/>
+                <w:i w:val="false"/>
+                <w:b w:val="false"/>
+                <w:u w:val="none"/>
+                <w:strike w:val="false"/>
+                <w:sz w:val="21"/>
+                <w:szCs w:val="21"/>
+                <w:color w:val="000000"/>
+              </w:rPr>
+              <w:t xml:space="preserve">762</w:t>
             </w:r>
           </w:p>
         </w:tc>
@@ -457,7 +531,6 @@
           </w:tcPr>
           <w:p>
             <w:pPr>
-              <w:pStyle w:val="Normal"/>
               <w:jc w:val="left"/>
               <w:pBdr>
                 <w:bottom w:val="none" w:sz="0" w:space="0" w:color="000000"/>
@@ -467,13 +540,24 @@
               </w:pBdr>
               <w:spacing w:after="80" w:before="80" w:line="240"/>
               <w:ind w:left="80" w:right="80" w:firstLine="0" w:firstLineChars="0"/>
+              <w:rPr>
+                <w:rFonts w:ascii="Arial" w:hAnsi="Arial" w:eastAsia="Arial" w:cs="Arial"/>
+                <w:i w:val="false"/>
+                <w:b w:val="false"/>
+                <w:u w:val="none"/>
+                <w:strike w:val="false"/>
+                <w:sz w:val="21"/>
+                <w:szCs w:val="21"/>
+                <w:color w:val="000000"/>
+              </w:rPr>
             </w:pPr>
             <w:r>
               <w:rPr>
-                <w:rFonts w:ascii="Arial" w:hAnsi="DejaVu Sans" w:eastAsia="DejaVu Sans" w:cs="DejaVu Sans"/>
-                <w:i w:val="false"/>
-                <w:b w:val="false"/>
-                <w:u w:val="none"/>
+                <w:rFonts w:ascii="Arial" w:hAnsi="Arial" w:eastAsia="Arial" w:cs="Arial"/>
+                <w:i w:val="false"/>
+                <w:b w:val="false"/>
+                <w:u w:val="none"/>
+                <w:strike w:val="false"/>
                 <w:sz w:val="21"/>
                 <w:szCs w:val="21"/>
                 <w:color w:val="000000"/>
@@ -507,7 +591,6 @@
           </w:tcPr>
           <w:p>
             <w:pPr>
-              <w:pStyle w:val="Normal"/>
               <w:jc w:val="left"/>
               <w:pBdr>
                 <w:bottom w:val="none" w:sz="0" w:space="0" w:color="000000"/>
@@ -517,13 +600,24 @@
               </w:pBdr>
               <w:spacing w:after="80" w:before="80" w:line="240"/>
               <w:ind w:left="80" w:right="80" w:firstLine="0" w:firstLineChars="0"/>
+              <w:rPr>
+                <w:rFonts w:ascii="Arial" w:hAnsi="Arial" w:eastAsia="Arial" w:cs="Arial"/>
+                <w:i w:val="false"/>
+                <w:b w:val="false"/>
+                <w:u w:val="none"/>
+                <w:strike w:val="false"/>
+                <w:sz w:val="21"/>
+                <w:szCs w:val="21"/>
+                <w:color w:val="000000"/>
+              </w:rPr>
             </w:pPr>
             <w:r>
               <w:rPr>
-                <w:rFonts w:ascii="Arial" w:hAnsi="DejaVu Sans" w:eastAsia="DejaVu Sans" w:cs="DejaVu Sans"/>
-                <w:i w:val="false"/>
-                <w:b w:val="false"/>
-                <w:u w:val="none"/>
+                <w:rFonts w:ascii="Arial" w:hAnsi="Arial" w:eastAsia="Arial" w:cs="Arial"/>
+                <w:i w:val="false"/>
+                <w:b w:val="false"/>
+                <w:u w:val="none"/>
+                <w:strike w:val="false"/>
                 <w:sz w:val="21"/>
                 <w:szCs w:val="21"/>
                 <w:color w:val="000000"/>
@@ -551,7 +645,6 @@
           </w:tcPr>
           <w:p>
             <w:pPr>
-              <w:pStyle w:val="Normal"/>
               <w:jc w:val="left"/>
               <w:pBdr>
                 <w:bottom w:val="none" w:sz="0" w:space="0" w:color="000000"/>
@@ -561,18 +654,29 @@
               </w:pBdr>
               <w:spacing w:after="80" w:before="80" w:line="240"/>
               <w:ind w:left="80" w:right="80" w:firstLine="0" w:firstLineChars="0"/>
+              <w:rPr>
+                <w:rFonts w:ascii="Arial" w:hAnsi="Arial" w:eastAsia="Arial" w:cs="Arial"/>
+                <w:i w:val="false"/>
+                <w:b w:val="false"/>
+                <w:u w:val="none"/>
+                <w:strike w:val="false"/>
+                <w:sz w:val="21"/>
+                <w:szCs w:val="21"/>
+                <w:color w:val="000000"/>
+              </w:rPr>
             </w:pPr>
             <w:r>
               <w:rPr>
-                <w:rFonts w:ascii="Arial" w:hAnsi="DejaVu Sans" w:eastAsia="DejaVu Sans" w:cs="DejaVu Sans"/>
-                <w:i w:val="false"/>
-                <w:b w:val="false"/>
-                <w:u w:val="none"/>
-                <w:sz w:val="21"/>
-                <w:szCs w:val="21"/>
-                <w:color w:val="000000"/>
-              </w:rPr>
-              <w:t xml:space="preserve">2,079</w:t>
+                <w:rFonts w:ascii="Arial" w:hAnsi="Arial" w:eastAsia="Arial" w:cs="Arial"/>
+                <w:i w:val="false"/>
+                <w:b w:val="false"/>
+                <w:u w:val="none"/>
+                <w:strike w:val="false"/>
+                <w:sz w:val="21"/>
+                <w:szCs w:val="21"/>
+                <w:color w:val="000000"/>
+              </w:rPr>
+              <w:t xml:space="preserve">2,257</w:t>
             </w:r>
           </w:p>
         </w:tc>
@@ -595,7 +699,6 @@
           </w:tcPr>
           <w:p>
             <w:pPr>
-              <w:pStyle w:val="Normal"/>
               <w:jc w:val="left"/>
               <w:pBdr>
                 <w:bottom w:val="none" w:sz="0" w:space="0" w:color="000000"/>
@@ -605,18 +708,29 @@
               </w:pBdr>
               <w:spacing w:after="80" w:before="80" w:line="240"/>
               <w:ind w:left="80" w:right="80" w:firstLine="0" w:firstLineChars="0"/>
+              <w:rPr>
+                <w:rFonts w:ascii="Arial" w:hAnsi="Arial" w:eastAsia="Arial" w:cs="Arial"/>
+                <w:i w:val="false"/>
+                <w:b w:val="false"/>
+                <w:u w:val="none"/>
+                <w:strike w:val="false"/>
+                <w:sz w:val="21"/>
+                <w:szCs w:val="21"/>
+                <w:color w:val="000000"/>
+              </w:rPr>
             </w:pPr>
             <w:r>
               <w:rPr>
-                <w:rFonts w:ascii="Arial" w:hAnsi="DejaVu Sans" w:eastAsia="DejaVu Sans" w:cs="DejaVu Sans"/>
-                <w:i w:val="false"/>
-                <w:b w:val="false"/>
-                <w:u w:val="none"/>
-                <w:sz w:val="21"/>
-                <w:szCs w:val="21"/>
-                <w:color w:val="000000"/>
-              </w:rPr>
-              <w:t xml:space="preserve">2,230</w:t>
+                <w:rFonts w:ascii="Arial" w:hAnsi="Arial" w:eastAsia="Arial" w:cs="Arial"/>
+                <w:i w:val="false"/>
+                <w:b w:val="false"/>
+                <w:u w:val="none"/>
+                <w:strike w:val="false"/>
+                <w:sz w:val="21"/>
+                <w:szCs w:val="21"/>
+                <w:color w:val="000000"/>
+              </w:rPr>
+              <w:t xml:space="preserve">2,400</w:t>
             </w:r>
           </w:p>
         </w:tc>
@@ -639,7 +753,6 @@
           </w:tcPr>
           <w:p>
             <w:pPr>
-              <w:pStyle w:val="Normal"/>
               <w:jc w:val="left"/>
               <w:pBdr>
                 <w:bottom w:val="none" w:sz="0" w:space="0" w:color="000000"/>
@@ -649,13 +762,24 @@
               </w:pBdr>
               <w:spacing w:after="80" w:before="80" w:line="240"/>
               <w:ind w:left="80" w:right="80" w:firstLine="0" w:firstLineChars="0"/>
+              <w:rPr>
+                <w:rFonts w:ascii="Arial" w:hAnsi="Arial" w:eastAsia="Arial" w:cs="Arial"/>
+                <w:i w:val="false"/>
+                <w:b w:val="false"/>
+                <w:u w:val="none"/>
+                <w:strike w:val="false"/>
+                <w:sz w:val="21"/>
+                <w:szCs w:val="21"/>
+                <w:color w:val="000000"/>
+              </w:rPr>
             </w:pPr>
             <w:r>
               <w:rPr>
-                <w:rFonts w:ascii="Arial" w:hAnsi="DejaVu Sans" w:eastAsia="DejaVu Sans" w:cs="DejaVu Sans"/>
-                <w:i w:val="false"/>
-                <w:b w:val="false"/>
-                <w:u w:val="none"/>
+                <w:rFonts w:ascii="Arial" w:hAnsi="Arial" w:eastAsia="Arial" w:cs="Arial"/>
+                <w:i w:val="false"/>
+                <w:b w:val="false"/>
+                <w:u w:val="none"/>
+                <w:strike w:val="false"/>
                 <w:sz w:val="21"/>
                 <w:szCs w:val="21"/>
                 <w:color w:val="000000"/>
@@ -689,7 +813,6 @@
           </w:tcPr>
           <w:p>
             <w:pPr>
-              <w:pStyle w:val="Normal"/>
               <w:jc w:val="left"/>
               <w:pBdr>
                 <w:bottom w:val="none" w:sz="0" w:space="0" w:color="000000"/>
@@ -699,13 +822,24 @@
               </w:pBdr>
               <w:spacing w:after="80" w:before="80" w:line="240"/>
               <w:ind w:left="80" w:right="80" w:firstLine="0" w:firstLineChars="0"/>
+              <w:rPr>
+                <w:rFonts w:ascii="Arial" w:hAnsi="Arial" w:eastAsia="Arial" w:cs="Arial"/>
+                <w:i w:val="false"/>
+                <w:b w:val="false"/>
+                <w:u w:val="none"/>
+                <w:strike w:val="false"/>
+                <w:sz w:val="21"/>
+                <w:szCs w:val="21"/>
+                <w:color w:val="000000"/>
+              </w:rPr>
             </w:pPr>
             <w:r>
               <w:rPr>
-                <w:rFonts w:ascii="Arial" w:hAnsi="DejaVu Sans" w:eastAsia="DejaVu Sans" w:cs="DejaVu Sans"/>
-                <w:i w:val="false"/>
-                <w:b w:val="false"/>
-                <w:u w:val="none"/>
+                <w:rFonts w:ascii="Arial" w:hAnsi="Arial" w:eastAsia="Arial" w:cs="Arial"/>
+                <w:i w:val="false"/>
+                <w:b w:val="false"/>
+                <w:u w:val="none"/>
+                <w:strike w:val="false"/>
                 <w:sz w:val="21"/>
                 <w:szCs w:val="21"/>
                 <w:color w:val="000000"/>
@@ -733,7 +867,6 @@
           </w:tcPr>
           <w:p>
             <w:pPr>
-              <w:pStyle w:val="Normal"/>
               <w:jc w:val="left"/>
               <w:pBdr>
                 <w:bottom w:val="none" w:sz="0" w:space="0" w:color="000000"/>
@@ -743,13 +876,24 @@
               </w:pBdr>
               <w:spacing w:after="80" w:before="80" w:line="240"/>
               <w:ind w:left="80" w:right="80" w:firstLine="0" w:firstLineChars="0"/>
+              <w:rPr>
+                <w:rFonts w:ascii="Arial" w:hAnsi="Arial" w:eastAsia="Arial" w:cs="Arial"/>
+                <w:i w:val="false"/>
+                <w:b w:val="false"/>
+                <w:u w:val="none"/>
+                <w:strike w:val="false"/>
+                <w:sz w:val="21"/>
+                <w:szCs w:val="21"/>
+                <w:color w:val="000000"/>
+              </w:rPr>
             </w:pPr>
             <w:r>
               <w:rPr>
-                <w:rFonts w:ascii="Arial" w:hAnsi="DejaVu Sans" w:eastAsia="DejaVu Sans" w:cs="DejaVu Sans"/>
-                <w:i w:val="false"/>
-                <w:b w:val="false"/>
-                <w:u w:val="none"/>
+                <w:rFonts w:ascii="Arial" w:hAnsi="Arial" w:eastAsia="Arial" w:cs="Arial"/>
+                <w:i w:val="false"/>
+                <w:b w:val="false"/>
+                <w:u w:val="none"/>
+                <w:strike w:val="false"/>
                 <w:sz w:val="21"/>
                 <w:szCs w:val="21"/>
                 <w:color w:val="000000"/>
@@ -777,7 +921,6 @@
           </w:tcPr>
           <w:p>
             <w:pPr>
-              <w:pStyle w:val="Normal"/>
               <w:jc w:val="left"/>
               <w:pBdr>
                 <w:bottom w:val="none" w:sz="0" w:space="0" w:color="000000"/>
@@ -787,13 +930,24 @@
               </w:pBdr>
               <w:spacing w:after="80" w:before="80" w:line="240"/>
               <w:ind w:left="80" w:right="80" w:firstLine="0" w:firstLineChars="0"/>
+              <w:rPr>
+                <w:rFonts w:ascii="Arial" w:hAnsi="Arial" w:eastAsia="Arial" w:cs="Arial"/>
+                <w:i w:val="false"/>
+                <w:b w:val="false"/>
+                <w:u w:val="none"/>
+                <w:strike w:val="false"/>
+                <w:sz w:val="21"/>
+                <w:szCs w:val="21"/>
+                <w:color w:val="000000"/>
+              </w:rPr>
             </w:pPr>
             <w:r>
               <w:rPr>
-                <w:rFonts w:ascii="Arial" w:hAnsi="DejaVu Sans" w:eastAsia="DejaVu Sans" w:cs="DejaVu Sans"/>
-                <w:i w:val="false"/>
-                <w:b w:val="false"/>
-                <w:u w:val="none"/>
+                <w:rFonts w:ascii="Arial" w:hAnsi="Arial" w:eastAsia="Arial" w:cs="Arial"/>
+                <w:i w:val="false"/>
+                <w:b w:val="false"/>
+                <w:u w:val="none"/>
+                <w:strike w:val="false"/>
                 <w:sz w:val="21"/>
                 <w:szCs w:val="21"/>
                 <w:color w:val="000000"/>
@@ -821,7 +975,6 @@
           </w:tcPr>
           <w:p>
             <w:pPr>
-              <w:pStyle w:val="Normal"/>
               <w:jc w:val="left"/>
               <w:pBdr>
                 <w:bottom w:val="none" w:sz="0" w:space="0" w:color="000000"/>
@@ -831,13 +984,24 @@
               </w:pBdr>
               <w:spacing w:after="80" w:before="80" w:line="240"/>
               <w:ind w:left="80" w:right="80" w:firstLine="0" w:firstLineChars="0"/>
+              <w:rPr>
+                <w:rFonts w:ascii="Arial" w:hAnsi="Arial" w:eastAsia="Arial" w:cs="Arial"/>
+                <w:i w:val="false"/>
+                <w:b w:val="false"/>
+                <w:u w:val="none"/>
+                <w:strike w:val="false"/>
+                <w:sz w:val="21"/>
+                <w:szCs w:val="21"/>
+                <w:color w:val="000000"/>
+              </w:rPr>
             </w:pPr>
             <w:r>
               <w:rPr>
-                <w:rFonts w:ascii="Arial" w:hAnsi="DejaVu Sans" w:eastAsia="DejaVu Sans" w:cs="DejaVu Sans"/>
-                <w:i w:val="false"/>
-                <w:b w:val="false"/>
-                <w:u w:val="none"/>
+                <w:rFonts w:ascii="Arial" w:hAnsi="Arial" w:eastAsia="Arial" w:cs="Arial"/>
+                <w:i w:val="false"/>
+                <w:b w:val="false"/>
+                <w:u w:val="none"/>
+                <w:strike w:val="false"/>
                 <w:sz w:val="21"/>
                 <w:szCs w:val="21"/>
                 <w:color w:val="000000"/>
@@ -867,6 +1031,7 @@
           <w:i w:val="false"/>
           <w:b w:val="true"/>
           <w:u w:val="none"/>
+          <w:strike w:val="false"/>
           <w:sz w:val="26"/>
           <w:szCs w:val="26"/>
           <w:color w:val="215A9E"/>
@@ -893,6 +1058,7 @@
           <w:i w:val="false"/>
           <w:b w:val="false"/>
           <w:u w:val="none"/>
+          <w:strike w:val="false"/>
           <w:sz w:val="22"/>
           <w:szCs w:val="22"/>
           <w:color w:val="000000"/>
@@ -919,6 +1085,7 @@
           <w:i w:val="false"/>
           <w:b w:val="false"/>
           <w:u w:val="none"/>
+          <w:strike w:val="false"/>
           <w:sz w:val="22"/>
           <w:szCs w:val="22"/>
           <w:color w:val="000000"/>
@@ -945,6 +1112,7 @@
           <w:i w:val="false"/>
           <w:b w:val="false"/>
           <w:u w:val="none"/>
+          <w:strike w:val="false"/>
           <w:sz w:val="22"/>
           <w:szCs w:val="22"/>
           <w:color w:val="000000"/>
@@ -971,6 +1139,7 @@
           <w:i w:val="false"/>
           <w:b w:val="false"/>
           <w:u w:val="none"/>
+          <w:strike w:val="false"/>
           <w:sz w:val="22"/>
           <w:szCs w:val="22"/>
           <w:color w:val="000000"/>
@@ -997,6 +1166,7 @@
           <w:i w:val="false"/>
           <w:b w:val="false"/>
           <w:u w:val="none"/>
+          <w:strike w:val="false"/>
           <w:sz w:val="22"/>
           <w:szCs w:val="22"/>
           <w:color w:val="000000"/>
@@ -1029,6 +1199,7 @@
           <w:i w:val="false"/>
           <w:b w:val="false"/>
           <w:u w:val="none"/>
+          <w:strike w:val="false"/>
           <w:sz w:val="18"/>
           <w:szCs w:val="18"/>
           <w:color w:val="545860"/>
@@ -1055,6 +1226,7 @@
           <w:i w:val="false"/>
           <w:b w:val="true"/>
           <w:u w:val="none"/>
+          <w:strike w:val="false"/>
           <w:sz w:val="36"/>
           <w:szCs w:val="36"/>
           <w:color w:val="063360"/>
@@ -1081,6 +1253,7 @@
           <w:i w:val="true"/>
           <w:b w:val="false"/>
           <w:u w:val="none"/>
+          <w:strike w:val="false"/>
           <w:sz w:val="18"/>
           <w:szCs w:val="18"/>
           <w:color w:val="215A9E"/>
@@ -1107,11 +1280,12 @@
           <w:i w:val="false"/>
           <w:b w:val="false"/>
           <w:u w:val="none"/>
+          <w:strike w:val="false"/>
           <w:sz w:val="22"/>
           <w:szCs w:val="22"/>
           <w:color w:val="000000"/>
         </w:rPr>
-        <w:t xml:space="preserve">The same data as a regression, the way an evaluator would report it. Standard errors are clustered by neighbourhood.</w:t>
+        <w:t xml:space="preserve">The same data as a regression, the way an evaluator would report it. Each business appears twice (before and after), so standard errors are clustered by business.</w:t>
       </w:r>
     </w:p>
     <w:tbl xmlns:a="http://schemas.openxmlformats.org/drawingml/2006/main" xmlns:pic="http://schemas.openxmlformats.org/drawingml/2006/picture">
@@ -1152,7 +1326,6 @@
           </w:tcPr>
           <w:p>
             <w:pPr>
-              <w:pStyle w:val="Normal"/>
               <w:jc w:val="left"/>
               <w:pBdr>
                 <w:bottom w:val="none" w:sz="0" w:space="0" w:color="000000"/>
@@ -1162,13 +1335,24 @@
               </w:pBdr>
               <w:spacing w:after="80" w:before="80" w:line="240"/>
               <w:ind w:left="80" w:right="80" w:firstLine="0" w:firstLineChars="0"/>
+              <w:rPr>
+                <w:rFonts w:ascii="Arial" w:hAnsi="Arial" w:eastAsia="Arial" w:cs="Arial"/>
+                <w:i w:val="false"/>
+                <w:b w:val="true"/>
+                <w:u w:val="none"/>
+                <w:strike w:val="false"/>
+                <w:sz w:val="21"/>
+                <w:szCs w:val="21"/>
+                <w:color w:val="063360"/>
+              </w:rPr>
             </w:pPr>
             <w:r>
               <w:rPr>
-                <w:rFonts w:ascii="Arial" w:hAnsi="DejaVu Sans" w:eastAsia="DejaVu Sans" w:cs="DejaVu Sans"/>
+                <w:rFonts w:ascii="Arial" w:hAnsi="Arial" w:eastAsia="Arial" w:cs="Arial"/>
                 <w:i w:val="false"/>
                 <w:b w:val="true"/>
                 <w:u w:val="none"/>
+                <w:strike w:val="false"/>
                 <w:sz w:val="21"/>
                 <w:szCs w:val="21"/>
                 <w:color w:val="063360"/>
@@ -1196,7 +1380,6 @@
           </w:tcPr>
           <w:p>
             <w:pPr>
-              <w:pStyle w:val="Normal"/>
               <w:jc w:val="left"/>
               <w:pBdr>
                 <w:bottom w:val="none" w:sz="0" w:space="0" w:color="000000"/>
@@ -1206,13 +1389,24 @@
               </w:pBdr>
               <w:spacing w:after="80" w:before="80" w:line="240"/>
               <w:ind w:left="80" w:right="80" w:firstLine="0" w:firstLineChars="0"/>
+              <w:rPr>
+                <w:rFonts w:ascii="Arial" w:hAnsi="Arial" w:eastAsia="Arial" w:cs="Arial"/>
+                <w:i w:val="false"/>
+                <w:b w:val="true"/>
+                <w:u w:val="none"/>
+                <w:strike w:val="false"/>
+                <w:sz w:val="21"/>
+                <w:szCs w:val="21"/>
+                <w:color w:val="063360"/>
+              </w:rPr>
             </w:pPr>
             <w:r>
               <w:rPr>
-                <w:rFonts w:ascii="Arial" w:hAnsi="DejaVu Sans" w:eastAsia="DejaVu Sans" w:cs="DejaVu Sans"/>
+                <w:rFonts w:ascii="Arial" w:hAnsi="Arial" w:eastAsia="Arial" w:cs="Arial"/>
                 <w:i w:val="false"/>
                 <w:b w:val="true"/>
                 <w:u w:val="none"/>
+                <w:strike w:val="false"/>
                 <w:sz w:val="21"/>
                 <w:szCs w:val="21"/>
                 <w:color w:val="063360"/>
@@ -1240,7 +1434,6 @@
           </w:tcPr>
           <w:p>
             <w:pPr>
-              <w:pStyle w:val="Normal"/>
               <w:jc w:val="left"/>
               <w:pBdr>
                 <w:bottom w:val="none" w:sz="0" w:space="0" w:color="000000"/>
@@ -1250,13 +1443,24 @@
               </w:pBdr>
               <w:spacing w:after="80" w:before="80" w:line="240"/>
               <w:ind w:left="80" w:right="80" w:firstLine="0" w:firstLineChars="0"/>
+              <w:rPr>
+                <w:rFonts w:ascii="Arial" w:hAnsi="Arial" w:eastAsia="Arial" w:cs="Arial"/>
+                <w:i w:val="false"/>
+                <w:b w:val="true"/>
+                <w:u w:val="none"/>
+                <w:strike w:val="false"/>
+                <w:sz w:val="21"/>
+                <w:szCs w:val="21"/>
+                <w:color w:val="063360"/>
+              </w:rPr>
             </w:pPr>
             <w:r>
               <w:rPr>
-                <w:rFonts w:ascii="Arial" w:hAnsi="DejaVu Sans" w:eastAsia="DejaVu Sans" w:cs="DejaVu Sans"/>
+                <w:rFonts w:ascii="Arial" w:hAnsi="Arial" w:eastAsia="Arial" w:cs="Arial"/>
                 <w:i w:val="false"/>
                 <w:b w:val="true"/>
                 <w:u w:val="none"/>
+                <w:strike w:val="false"/>
                 <w:sz w:val="21"/>
                 <w:szCs w:val="21"/>
                 <w:color w:val="063360"/>
@@ -1284,7 +1488,6 @@
           </w:tcPr>
           <w:p>
             <w:pPr>
-              <w:pStyle w:val="Normal"/>
               <w:jc w:val="left"/>
               <w:pBdr>
                 <w:bottom w:val="none" w:sz="0" w:space="0" w:color="000000"/>
@@ -1294,13 +1497,24 @@
               </w:pBdr>
               <w:spacing w:after="80" w:before="80" w:line="240"/>
               <w:ind w:left="80" w:right="80" w:firstLine="0" w:firstLineChars="0"/>
+              <w:rPr>
+                <w:rFonts w:ascii="Arial" w:hAnsi="Arial" w:eastAsia="Arial" w:cs="Arial"/>
+                <w:i w:val="false"/>
+                <w:b w:val="true"/>
+                <w:u w:val="none"/>
+                <w:strike w:val="false"/>
+                <w:sz w:val="21"/>
+                <w:szCs w:val="21"/>
+                <w:color w:val="063360"/>
+              </w:rPr>
             </w:pPr>
             <w:r>
               <w:rPr>
-                <w:rFonts w:ascii="Arial" w:hAnsi="DejaVu Sans" w:eastAsia="DejaVu Sans" w:cs="DejaVu Sans"/>
+                <w:rFonts w:ascii="Arial" w:hAnsi="Arial" w:eastAsia="Arial" w:cs="Arial"/>
                 <w:i w:val="false"/>
                 <w:b w:val="true"/>
                 <w:u w:val="none"/>
+                <w:strike w:val="false"/>
                 <w:sz w:val="21"/>
                 <w:szCs w:val="21"/>
                 <w:color w:val="063360"/>
@@ -1328,7 +1542,6 @@
           </w:tcPr>
           <w:p>
             <w:pPr>
-              <w:pStyle w:val="Normal"/>
               <w:jc w:val="left"/>
               <w:pBdr>
                 <w:bottom w:val="none" w:sz="0" w:space="0" w:color="000000"/>
@@ -1338,13 +1551,24 @@
               </w:pBdr>
               <w:spacing w:after="80" w:before="80" w:line="240"/>
               <w:ind w:left="80" w:right="80" w:firstLine="0" w:firstLineChars="0"/>
+              <w:rPr>
+                <w:rFonts w:ascii="Arial" w:hAnsi="Arial" w:eastAsia="Arial" w:cs="Arial"/>
+                <w:i w:val="false"/>
+                <w:b w:val="true"/>
+                <w:u w:val="none"/>
+                <w:strike w:val="false"/>
+                <w:sz w:val="21"/>
+                <w:szCs w:val="21"/>
+                <w:color w:val="063360"/>
+              </w:rPr>
             </w:pPr>
             <w:r>
               <w:rPr>
-                <w:rFonts w:ascii="Arial" w:hAnsi="DejaVu Sans" w:eastAsia="DejaVu Sans" w:cs="DejaVu Sans"/>
+                <w:rFonts w:ascii="Arial" w:hAnsi="Arial" w:eastAsia="Arial" w:cs="Arial"/>
                 <w:i w:val="false"/>
                 <w:b w:val="true"/>
                 <w:u w:val="none"/>
+                <w:strike w:val="false"/>
                 <w:sz w:val="21"/>
                 <w:szCs w:val="21"/>
                 <w:color w:val="063360"/>
@@ -1378,7 +1602,6 @@
           </w:tcPr>
           <w:p>
             <w:pPr>
-              <w:pStyle w:val="Normal"/>
               <w:jc w:val="left"/>
               <w:pBdr>
                 <w:bottom w:val="none" w:sz="0" w:space="0" w:color="000000"/>
@@ -1388,13 +1611,24 @@
               </w:pBdr>
               <w:spacing w:after="80" w:before="80" w:line="240"/>
               <w:ind w:left="80" w:right="80" w:firstLine="0" w:firstLineChars="0"/>
+              <w:rPr>
+                <w:rFonts w:ascii="Arial" w:hAnsi="Arial" w:eastAsia="Arial" w:cs="Arial"/>
+                <w:i w:val="false"/>
+                <w:b w:val="false"/>
+                <w:u w:val="none"/>
+                <w:strike w:val="false"/>
+                <w:sz w:val="21"/>
+                <w:szCs w:val="21"/>
+                <w:color w:val="000000"/>
+              </w:rPr>
             </w:pPr>
             <w:r>
               <w:rPr>
-                <w:rFonts w:ascii="Arial" w:hAnsi="DejaVu Sans" w:eastAsia="DejaVu Sans" w:cs="DejaVu Sans"/>
-                <w:i w:val="false"/>
-                <w:b w:val="false"/>
-                <w:u w:val="none"/>
+                <w:rFonts w:ascii="Arial" w:hAnsi="Arial" w:eastAsia="Arial" w:cs="Arial"/>
+                <w:i w:val="false"/>
+                <w:b w:val="false"/>
+                <w:u w:val="none"/>
+                <w:strike w:val="false"/>
                 <w:sz w:val="21"/>
                 <w:szCs w:val="21"/>
                 <w:color w:val="000000"/>
@@ -1422,7 +1656,6 @@
           </w:tcPr>
           <w:p>
             <w:pPr>
-              <w:pStyle w:val="Normal"/>
               <w:jc w:val="left"/>
               <w:pBdr>
                 <w:bottom w:val="none" w:sz="0" w:space="0" w:color="000000"/>
@@ -1432,18 +1665,29 @@
               </w:pBdr>
               <w:spacing w:after="80" w:before="80" w:line="240"/>
               <w:ind w:left="80" w:right="80" w:firstLine="0" w:firstLineChars="0"/>
+              <w:rPr>
+                <w:rFonts w:ascii="Arial" w:hAnsi="Arial" w:eastAsia="Arial" w:cs="Arial"/>
+                <w:i w:val="false"/>
+                <w:b w:val="false"/>
+                <w:u w:val="none"/>
+                <w:strike w:val="false"/>
+                <w:sz w:val="21"/>
+                <w:szCs w:val="21"/>
+                <w:color w:val="000000"/>
+              </w:rPr>
             </w:pPr>
             <w:r>
               <w:rPr>
-                <w:rFonts w:ascii="Arial" w:hAnsi="DejaVu Sans" w:eastAsia="DejaVu Sans" w:cs="DejaVu Sans"/>
-                <w:i w:val="false"/>
-                <w:b w:val="false"/>
-                <w:u w:val="none"/>
-                <w:sz w:val="21"/>
-                <w:szCs w:val="21"/>
-                <w:color w:val="000000"/>
-              </w:rPr>
-              <w:t xml:space="preserve">2,079</w:t>
+                <w:rFonts w:ascii="Arial" w:hAnsi="Arial" w:eastAsia="Arial" w:cs="Arial"/>
+                <w:i w:val="false"/>
+                <w:b w:val="false"/>
+                <w:u w:val="none"/>
+                <w:strike w:val="false"/>
+                <w:sz w:val="21"/>
+                <w:szCs w:val="21"/>
+                <w:color w:val="000000"/>
+              </w:rPr>
+              <w:t xml:space="preserve">2,257</w:t>
             </w:r>
           </w:p>
         </w:tc>
@@ -1466,7 +1710,6 @@
           </w:tcPr>
           <w:p>
             <w:pPr>
-              <w:pStyle w:val="Normal"/>
               <w:jc w:val="left"/>
               <w:pBdr>
                 <w:bottom w:val="none" w:sz="0" w:space="0" w:color="000000"/>
@@ -1476,18 +1719,29 @@
               </w:pBdr>
               <w:spacing w:after="80" w:before="80" w:line="240"/>
               <w:ind w:left="80" w:right="80" w:firstLine="0" w:firstLineChars="0"/>
+              <w:rPr>
+                <w:rFonts w:ascii="Arial" w:hAnsi="Arial" w:eastAsia="Arial" w:cs="Arial"/>
+                <w:i w:val="false"/>
+                <w:b w:val="false"/>
+                <w:u w:val="none"/>
+                <w:strike w:val="false"/>
+                <w:sz w:val="21"/>
+                <w:szCs w:val="21"/>
+                <w:color w:val="000000"/>
+              </w:rPr>
             </w:pPr>
             <w:r>
               <w:rPr>
-                <w:rFonts w:ascii="Arial" w:hAnsi="DejaVu Sans" w:eastAsia="DejaVu Sans" w:cs="DejaVu Sans"/>
-                <w:i w:val="false"/>
-                <w:b w:val="false"/>
-                <w:u w:val="none"/>
-                <w:sz w:val="21"/>
-                <w:szCs w:val="21"/>
-                <w:color w:val="000000"/>
-              </w:rPr>
-              <w:t xml:space="preserve">17</w:t>
+                <w:rFonts w:ascii="Arial" w:hAnsi="Arial" w:eastAsia="Arial" w:cs="Arial"/>
+                <w:i w:val="false"/>
+                <w:b w:val="false"/>
+                <w:u w:val="none"/>
+                <w:strike w:val="false"/>
+                <w:sz w:val="21"/>
+                <w:szCs w:val="21"/>
+                <w:color w:val="000000"/>
+              </w:rPr>
+              <w:t xml:space="preserve">8</w:t>
             </w:r>
           </w:p>
         </w:tc>
@@ -1510,7 +1764,6 @@
           </w:tcPr>
           <w:p>
             <w:pPr>
-              <w:pStyle w:val="Normal"/>
               <w:jc w:val="left"/>
               <w:pBdr>
                 <w:bottom w:val="none" w:sz="0" w:space="0" w:color="000000"/>
@@ -1520,13 +1773,24 @@
               </w:pBdr>
               <w:spacing w:after="80" w:before="80" w:line="240"/>
               <w:ind w:left="80" w:right="80" w:firstLine="0" w:firstLineChars="0"/>
+              <w:rPr>
+                <w:rFonts w:ascii="Arial" w:hAnsi="Arial" w:eastAsia="Arial" w:cs="Arial"/>
+                <w:i w:val="false"/>
+                <w:b w:val="false"/>
+                <w:u w:val="none"/>
+                <w:strike w:val="false"/>
+                <w:sz w:val="21"/>
+                <w:szCs w:val="21"/>
+                <w:color w:val="000000"/>
+              </w:rPr>
             </w:pPr>
             <w:r>
               <w:rPr>
-                <w:rFonts w:ascii="Arial" w:hAnsi="DejaVu Sans" w:eastAsia="DejaVu Sans" w:cs="DejaVu Sans"/>
-                <w:i w:val="false"/>
-                <w:b w:val="false"/>
-                <w:u w:val="none"/>
+                <w:rFonts w:ascii="Arial" w:hAnsi="Arial" w:eastAsia="Arial" w:cs="Arial"/>
+                <w:i w:val="false"/>
+                <w:b w:val="false"/>
+                <w:u w:val="none"/>
+                <w:strike w:val="false"/>
                 <w:sz w:val="21"/>
                 <w:szCs w:val="21"/>
                 <w:color w:val="000000"/>
@@ -1554,7 +1818,6 @@
           </w:tcPr>
           <w:p>
             <w:pPr>
-              <w:pStyle w:val="Normal"/>
               <w:jc w:val="left"/>
               <w:pBdr>
                 <w:bottom w:val="none" w:sz="0" w:space="0" w:color="000000"/>
@@ -1564,18 +1827,29 @@
               </w:pBdr>
               <w:spacing w:after="80" w:before="80" w:line="240"/>
               <w:ind w:left="80" w:right="80" w:firstLine="0" w:firstLineChars="0"/>
+              <w:rPr>
+                <w:rFonts w:ascii="Arial" w:hAnsi="Arial" w:eastAsia="Arial" w:cs="Arial"/>
+                <w:i w:val="false"/>
+                <w:b w:val="false"/>
+                <w:u w:val="none"/>
+                <w:strike w:val="false"/>
+                <w:sz w:val="21"/>
+                <w:szCs w:val="21"/>
+                <w:color w:val="000000"/>
+              </w:rPr>
             </w:pPr>
             <w:r>
               <w:rPr>
-                <w:rFonts w:ascii="Arial" w:hAnsi="DejaVu Sans" w:eastAsia="DejaVu Sans" w:cs="DejaVu Sans"/>
-                <w:i w:val="false"/>
-                <w:b w:val="false"/>
-                <w:u w:val="none"/>
-                <w:sz w:val="21"/>
-                <w:szCs w:val="21"/>
-                <w:color w:val="000000"/>
-              </w:rPr>
-              <w:t xml:space="preserve">[2,044, 2,114]</w:t>
+                <w:rFonts w:ascii="Arial" w:hAnsi="Arial" w:eastAsia="Arial" w:cs="Arial"/>
+                <w:i w:val="false"/>
+                <w:b w:val="false"/>
+                <w:u w:val="none"/>
+                <w:strike w:val="false"/>
+                <w:sz w:val="21"/>
+                <w:szCs w:val="21"/>
+                <w:color w:val="000000"/>
+              </w:rPr>
+              <w:t xml:space="preserve">[2,241, 2,273]</w:t>
             </w:r>
           </w:p>
         </w:tc>
@@ -1604,7 +1878,6 @@
           </w:tcPr>
           <w:p>
             <w:pPr>
-              <w:pStyle w:val="Normal"/>
               <w:jc w:val="left"/>
               <w:pBdr>
                 <w:bottom w:val="none" w:sz="0" w:space="0" w:color="000000"/>
@@ -1614,18 +1887,29 @@
               </w:pBdr>
               <w:spacing w:after="80" w:before="80" w:line="240"/>
               <w:ind w:left="80" w:right="80" w:firstLine="0" w:firstLineChars="0"/>
+              <w:rPr>
+                <w:rFonts w:ascii="Arial" w:hAnsi="Arial" w:eastAsia="Arial" w:cs="Arial"/>
+                <w:i w:val="false"/>
+                <w:b w:val="false"/>
+                <w:u w:val="none"/>
+                <w:strike w:val="false"/>
+                <w:sz w:val="21"/>
+                <w:szCs w:val="21"/>
+                <w:color w:val="000000"/>
+              </w:rPr>
             </w:pPr>
             <w:r>
               <w:rPr>
-                <w:rFonts w:ascii="Arial" w:hAnsi="DejaVu Sans" w:eastAsia="DejaVu Sans" w:cs="DejaVu Sans"/>
-                <w:i w:val="false"/>
-                <w:b w:val="false"/>
-                <w:u w:val="none"/>
-                <w:sz w:val="21"/>
-                <w:szCs w:val="21"/>
-                <w:color w:val="000000"/>
-              </w:rPr>
-              <w:t xml:space="preserve">After (round 1)</w:t>
+                <w:rFonts w:ascii="Arial" w:hAnsi="Arial" w:eastAsia="Arial" w:cs="Arial"/>
+                <w:i w:val="false"/>
+                <w:b w:val="false"/>
+                <w:u w:val="none"/>
+                <w:strike w:val="false"/>
+                <w:sz w:val="21"/>
+                <w:szCs w:val="21"/>
+                <w:color w:val="000000"/>
+              </w:rPr>
+              <w:t xml:space="preserve">After</w:t>
             </w:r>
           </w:p>
         </w:tc>
@@ -1648,7 +1932,6 @@
           </w:tcPr>
           <w:p>
             <w:pPr>
-              <w:pStyle w:val="Normal"/>
               <w:jc w:val="left"/>
               <w:pBdr>
                 <w:bottom w:val="none" w:sz="0" w:space="0" w:color="000000"/>
@@ -1658,18 +1941,29 @@
               </w:pBdr>
               <w:spacing w:after="80" w:before="80" w:line="240"/>
               <w:ind w:left="80" w:right="80" w:firstLine="0" w:firstLineChars="0"/>
+              <w:rPr>
+                <w:rFonts w:ascii="Arial" w:hAnsi="Arial" w:eastAsia="Arial" w:cs="Arial"/>
+                <w:i w:val="false"/>
+                <w:b w:val="false"/>
+                <w:u w:val="none"/>
+                <w:strike w:val="false"/>
+                <w:sz w:val="21"/>
+                <w:szCs w:val="21"/>
+                <w:color w:val="000000"/>
+              </w:rPr>
             </w:pPr>
             <w:r>
               <w:rPr>
-                <w:rFonts w:ascii="Arial" w:hAnsi="DejaVu Sans" w:eastAsia="DejaVu Sans" w:cs="DejaVu Sans"/>
-                <w:i w:val="false"/>
-                <w:b w:val="false"/>
-                <w:u w:val="none"/>
-                <w:sz w:val="21"/>
-                <w:szCs w:val="21"/>
-                <w:color w:val="000000"/>
-              </w:rPr>
-              <w:t xml:space="preserve">151</w:t>
+                <w:rFonts w:ascii="Arial" w:hAnsi="Arial" w:eastAsia="Arial" w:cs="Arial"/>
+                <w:i w:val="false"/>
+                <w:b w:val="false"/>
+                <w:u w:val="none"/>
+                <w:strike w:val="false"/>
+                <w:sz w:val="21"/>
+                <w:szCs w:val="21"/>
+                <w:color w:val="000000"/>
+              </w:rPr>
+              <w:t xml:space="preserve">144</w:t>
             </w:r>
           </w:p>
         </w:tc>
@@ -1692,7 +1986,6 @@
           </w:tcPr>
           <w:p>
             <w:pPr>
-              <w:pStyle w:val="Normal"/>
               <w:jc w:val="left"/>
               <w:pBdr>
                 <w:bottom w:val="none" w:sz="0" w:space="0" w:color="000000"/>
@@ -1702,18 +1995,29 @@
               </w:pBdr>
               <w:spacing w:after="80" w:before="80" w:line="240"/>
               <w:ind w:left="80" w:right="80" w:firstLine="0" w:firstLineChars="0"/>
+              <w:rPr>
+                <w:rFonts w:ascii="Arial" w:hAnsi="Arial" w:eastAsia="Arial" w:cs="Arial"/>
+                <w:i w:val="false"/>
+                <w:b w:val="false"/>
+                <w:u w:val="none"/>
+                <w:strike w:val="false"/>
+                <w:sz w:val="21"/>
+                <w:szCs w:val="21"/>
+                <w:color w:val="000000"/>
+              </w:rPr>
             </w:pPr>
             <w:r>
               <w:rPr>
-                <w:rFonts w:ascii="Arial" w:hAnsi="DejaVu Sans" w:eastAsia="DejaVu Sans" w:cs="DejaVu Sans"/>
-                <w:i w:val="false"/>
-                <w:b w:val="false"/>
-                <w:u w:val="none"/>
-                <w:sz w:val="21"/>
-                <w:szCs w:val="21"/>
-                <w:color w:val="000000"/>
-              </w:rPr>
-              <w:t xml:space="preserve">36</w:t>
+                <w:rFonts w:ascii="Arial" w:hAnsi="Arial" w:eastAsia="Arial" w:cs="Arial"/>
+                <w:i w:val="false"/>
+                <w:b w:val="false"/>
+                <w:u w:val="none"/>
+                <w:strike w:val="false"/>
+                <w:sz w:val="21"/>
+                <w:szCs w:val="21"/>
+                <w:color w:val="000000"/>
+              </w:rPr>
+              <w:t xml:space="preserve">7</w:t>
             </w:r>
           </w:p>
         </w:tc>
@@ -1736,7 +2040,6 @@
           </w:tcPr>
           <w:p>
             <w:pPr>
-              <w:pStyle w:val="Normal"/>
               <w:jc w:val="left"/>
               <w:pBdr>
                 <w:bottom w:val="none" w:sz="0" w:space="0" w:color="000000"/>
@@ -1746,13 +2049,24 @@
               </w:pBdr>
               <w:spacing w:after="80" w:before="80" w:line="240"/>
               <w:ind w:left="80" w:right="80" w:firstLine="0" w:firstLineChars="0"/>
+              <w:rPr>
+                <w:rFonts w:ascii="Arial" w:hAnsi="Arial" w:eastAsia="Arial" w:cs="Arial"/>
+                <w:i w:val="false"/>
+                <w:b w:val="false"/>
+                <w:u w:val="none"/>
+                <w:strike w:val="false"/>
+                <w:sz w:val="21"/>
+                <w:szCs w:val="21"/>
+                <w:color w:val="000000"/>
+              </w:rPr>
             </w:pPr>
             <w:r>
               <w:rPr>
-                <w:rFonts w:ascii="Arial" w:hAnsi="DejaVu Sans" w:eastAsia="DejaVu Sans" w:cs="DejaVu Sans"/>
-                <w:i w:val="false"/>
-                <w:b w:val="false"/>
-                <w:u w:val="none"/>
+                <w:rFonts w:ascii="Arial" w:hAnsi="Arial" w:eastAsia="Arial" w:cs="Arial"/>
+                <w:i w:val="false"/>
+                <w:b w:val="false"/>
+                <w:u w:val="none"/>
+                <w:strike w:val="false"/>
                 <w:sz w:val="21"/>
                 <w:szCs w:val="21"/>
                 <w:color w:val="000000"/>
@@ -1780,7 +2094,6 @@
           </w:tcPr>
           <w:p>
             <w:pPr>
-              <w:pStyle w:val="Normal"/>
               <w:jc w:val="left"/>
               <w:pBdr>
                 <w:bottom w:val="none" w:sz="0" w:space="0" w:color="000000"/>
@@ -1790,18 +2103,29 @@
               </w:pBdr>
               <w:spacing w:after="80" w:before="80" w:line="240"/>
               <w:ind w:left="80" w:right="80" w:firstLine="0" w:firstLineChars="0"/>
+              <w:rPr>
+                <w:rFonts w:ascii="Arial" w:hAnsi="Arial" w:eastAsia="Arial" w:cs="Arial"/>
+                <w:i w:val="false"/>
+                <w:b w:val="false"/>
+                <w:u w:val="none"/>
+                <w:strike w:val="false"/>
+                <w:sz w:val="21"/>
+                <w:szCs w:val="21"/>
+                <w:color w:val="000000"/>
+              </w:rPr>
             </w:pPr>
             <w:r>
               <w:rPr>
-                <w:rFonts w:ascii="Arial" w:hAnsi="DejaVu Sans" w:eastAsia="DejaVu Sans" w:cs="DejaVu Sans"/>
-                <w:i w:val="false"/>
-                <w:b w:val="false"/>
-                <w:u w:val="none"/>
-                <w:sz w:val="21"/>
-                <w:szCs w:val="21"/>
-                <w:color w:val="000000"/>
-              </w:rPr>
-              <w:t xml:space="preserve">[79, 224]</w:t>
+                <w:rFonts w:ascii="Arial" w:hAnsi="Arial" w:eastAsia="Arial" w:cs="Arial"/>
+                <w:i w:val="false"/>
+                <w:b w:val="false"/>
+                <w:u w:val="none"/>
+                <w:strike w:val="false"/>
+                <w:sz w:val="21"/>
+                <w:szCs w:val="21"/>
+                <w:color w:val="000000"/>
+              </w:rPr>
+              <w:t xml:space="preserve">[130, 157]</w:t>
             </w:r>
           </w:p>
         </w:tc>
@@ -1830,7 +2154,6 @@
           </w:tcPr>
           <w:p>
             <w:pPr>
-              <w:pStyle w:val="Normal"/>
               <w:jc w:val="left"/>
               <w:pBdr>
                 <w:bottom w:val="none" w:sz="0" w:space="0" w:color="000000"/>
@@ -1840,18 +2163,29 @@
               </w:pBdr>
               <w:spacing w:after="80" w:before="80" w:line="240"/>
               <w:ind w:left="80" w:right="80" w:firstLine="0" w:firstLineChars="0"/>
+              <w:rPr>
+                <w:rFonts w:ascii="Arial" w:hAnsi="Arial" w:eastAsia="Arial" w:cs="Arial"/>
+                <w:i w:val="false"/>
+                <w:b w:val="false"/>
+                <w:u w:val="none"/>
+                <w:strike w:val="false"/>
+                <w:sz w:val="21"/>
+                <w:szCs w:val="21"/>
+                <w:color w:val="000000"/>
+              </w:rPr>
             </w:pPr>
             <w:r>
               <w:rPr>
-                <w:rFonts w:ascii="Arial" w:hAnsi="DejaVu Sans" w:eastAsia="DejaVu Sans" w:cs="DejaVu Sans"/>
-                <w:i w:val="false"/>
-                <w:b w:val="false"/>
-                <w:u w:val="none"/>
-                <w:sz w:val="21"/>
-                <w:szCs w:val="21"/>
-                <w:color w:val="000000"/>
-              </w:rPr>
-              <w:t xml:space="preserve">Enrolled</w:t>
+                <w:rFonts w:ascii="Arial" w:hAnsi="Arial" w:eastAsia="Arial" w:cs="Arial"/>
+                <w:i w:val="false"/>
+                <w:b w:val="false"/>
+                <w:u w:val="none"/>
+                <w:strike w:val="false"/>
+                <w:sz w:val="21"/>
+                <w:szCs w:val="21"/>
+                <w:color w:val="000000"/>
+              </w:rPr>
+              <w:t xml:space="preserve">Took part</w:t>
             </w:r>
           </w:p>
         </w:tc>
@@ -1874,7 +2208,6 @@
           </w:tcPr>
           <w:p>
             <w:pPr>
-              <w:pStyle w:val="Normal"/>
               <w:jc w:val="left"/>
               <w:pBdr>
                 <w:bottom w:val="none" w:sz="0" w:space="0" w:color="000000"/>
@@ -1884,18 +2217,29 @@
               </w:pBdr>
               <w:spacing w:after="80" w:before="80" w:line="240"/>
               <w:ind w:left="80" w:right="80" w:firstLine="0" w:firstLineChars="0"/>
+              <w:rPr>
+                <w:rFonts w:ascii="Arial" w:hAnsi="Arial" w:eastAsia="Arial" w:cs="Arial"/>
+                <w:i w:val="false"/>
+                <w:b w:val="false"/>
+                <w:u w:val="none"/>
+                <w:strike w:val="false"/>
+                <w:sz w:val="21"/>
+                <w:szCs w:val="21"/>
+                <w:color w:val="000000"/>
+              </w:rPr>
             </w:pPr>
             <w:r>
               <w:rPr>
-                <w:rFonts w:ascii="Arial" w:hAnsi="DejaVu Sans" w:eastAsia="DejaVu Sans" w:cs="DejaVu Sans"/>
-                <w:i w:val="false"/>
-                <w:b w:val="false"/>
-                <w:u w:val="none"/>
-                <w:sz w:val="21"/>
-                <w:szCs w:val="21"/>
-                <w:color w:val="000000"/>
-              </w:rPr>
-              <w:t xml:space="preserve">-630</w:t>
+                <w:rFonts w:ascii="Arial" w:hAnsi="Arial" w:eastAsia="Arial" w:cs="Arial"/>
+                <w:i w:val="false"/>
+                <w:b w:val="false"/>
+                <w:u w:val="none"/>
+                <w:strike w:val="false"/>
+                <w:sz w:val="21"/>
+                <w:szCs w:val="21"/>
+                <w:color w:val="000000"/>
+              </w:rPr>
+              <w:t xml:space="preserve">-825</w:t>
             </w:r>
           </w:p>
         </w:tc>
@@ -1918,7 +2262,6 @@
           </w:tcPr>
           <w:p>
             <w:pPr>
-              <w:pStyle w:val="Normal"/>
               <w:jc w:val="left"/>
               <w:pBdr>
                 <w:bottom w:val="none" w:sz="0" w:space="0" w:color="000000"/>
@@ -1928,18 +2271,29 @@
               </w:pBdr>
               <w:spacing w:after="80" w:before="80" w:line="240"/>
               <w:ind w:left="80" w:right="80" w:firstLine="0" w:firstLineChars="0"/>
+              <w:rPr>
+                <w:rFonts w:ascii="Arial" w:hAnsi="Arial" w:eastAsia="Arial" w:cs="Arial"/>
+                <w:i w:val="false"/>
+                <w:b w:val="false"/>
+                <w:u w:val="none"/>
+                <w:strike w:val="false"/>
+                <w:sz w:val="21"/>
+                <w:szCs w:val="21"/>
+                <w:color w:val="000000"/>
+              </w:rPr>
             </w:pPr>
             <w:r>
               <w:rPr>
-                <w:rFonts w:ascii="Arial" w:hAnsi="DejaVu Sans" w:eastAsia="DejaVu Sans" w:cs="DejaVu Sans"/>
-                <w:i w:val="false"/>
-                <w:b w:val="false"/>
-                <w:u w:val="none"/>
-                <w:sz w:val="21"/>
-                <w:szCs w:val="21"/>
-                <w:color w:val="000000"/>
-              </w:rPr>
-              <w:t xml:space="preserve">19</w:t>
+                <w:rFonts w:ascii="Arial" w:hAnsi="Arial" w:eastAsia="Arial" w:cs="Arial"/>
+                <w:i w:val="false"/>
+                <w:b w:val="false"/>
+                <w:u w:val="none"/>
+                <w:strike w:val="false"/>
+                <w:sz w:val="21"/>
+                <w:szCs w:val="21"/>
+                <w:color w:val="000000"/>
+              </w:rPr>
+              <w:t xml:space="preserve">11</w:t>
             </w:r>
           </w:p>
         </w:tc>
@@ -1962,7 +2316,6 @@
           </w:tcPr>
           <w:p>
             <w:pPr>
-              <w:pStyle w:val="Normal"/>
               <w:jc w:val="left"/>
               <w:pBdr>
                 <w:bottom w:val="none" w:sz="0" w:space="0" w:color="000000"/>
@@ -1972,13 +2325,24 @@
               </w:pBdr>
               <w:spacing w:after="80" w:before="80" w:line="240"/>
               <w:ind w:left="80" w:right="80" w:firstLine="0" w:firstLineChars="0"/>
+              <w:rPr>
+                <w:rFonts w:ascii="Arial" w:hAnsi="Arial" w:eastAsia="Arial" w:cs="Arial"/>
+                <w:i w:val="false"/>
+                <w:b w:val="false"/>
+                <w:u w:val="none"/>
+                <w:strike w:val="false"/>
+                <w:sz w:val="21"/>
+                <w:szCs w:val="21"/>
+                <w:color w:val="000000"/>
+              </w:rPr>
             </w:pPr>
             <w:r>
               <w:rPr>
-                <w:rFonts w:ascii="Arial" w:hAnsi="DejaVu Sans" w:eastAsia="DejaVu Sans" w:cs="DejaVu Sans"/>
-                <w:i w:val="false"/>
-                <w:b w:val="false"/>
-                <w:u w:val="none"/>
+                <w:rFonts w:ascii="Arial" w:hAnsi="Arial" w:eastAsia="Arial" w:cs="Arial"/>
+                <w:i w:val="false"/>
+                <w:b w:val="false"/>
+                <w:u w:val="none"/>
+                <w:strike w:val="false"/>
                 <w:sz w:val="21"/>
                 <w:szCs w:val="21"/>
                 <w:color w:val="000000"/>
@@ -2006,7 +2370,6 @@
           </w:tcPr>
           <w:p>
             <w:pPr>
-              <w:pStyle w:val="Normal"/>
               <w:jc w:val="left"/>
               <w:pBdr>
                 <w:bottom w:val="none" w:sz="0" w:space="0" w:color="000000"/>
@@ -2016,18 +2379,29 @@
               </w:pBdr>
               <w:spacing w:after="80" w:before="80" w:line="240"/>
               <w:ind w:left="80" w:right="80" w:firstLine="0" w:firstLineChars="0"/>
+              <w:rPr>
+                <w:rFonts w:ascii="Arial" w:hAnsi="Arial" w:eastAsia="Arial" w:cs="Arial"/>
+                <w:i w:val="false"/>
+                <w:b w:val="false"/>
+                <w:u w:val="none"/>
+                <w:strike w:val="false"/>
+                <w:sz w:val="21"/>
+                <w:szCs w:val="21"/>
+                <w:color w:val="000000"/>
+              </w:rPr>
             </w:pPr>
             <w:r>
               <w:rPr>
-                <w:rFonts w:ascii="Arial" w:hAnsi="DejaVu Sans" w:eastAsia="DejaVu Sans" w:cs="DejaVu Sans"/>
-                <w:i w:val="false"/>
-                <w:b w:val="false"/>
-                <w:u w:val="none"/>
-                <w:sz w:val="21"/>
-                <w:szCs w:val="21"/>
-                <w:color w:val="000000"/>
-              </w:rPr>
-              <w:t xml:space="preserve">[-669, -591]</w:t>
+                <w:rFonts w:ascii="Arial" w:hAnsi="Arial" w:eastAsia="Arial" w:cs="Arial"/>
+                <w:i w:val="false"/>
+                <w:b w:val="false"/>
+                <w:u w:val="none"/>
+                <w:strike w:val="false"/>
+                <w:sz w:val="21"/>
+                <w:szCs w:val="21"/>
+                <w:color w:val="000000"/>
+              </w:rPr>
+              <w:t xml:space="preserve">[-846, -804]</w:t>
             </w:r>
           </w:p>
         </w:tc>
@@ -2056,7 +2430,6 @@
           </w:tcPr>
           <w:p>
             <w:pPr>
-              <w:pStyle w:val="Normal"/>
               <w:jc w:val="left"/>
               <w:pBdr>
                 <w:bottom w:val="none" w:sz="0" w:space="0" w:color="000000"/>
@@ -2066,18 +2439,29 @@
               </w:pBdr>
               <w:spacing w:after="80" w:before="80" w:line="240"/>
               <w:ind w:left="80" w:right="80" w:firstLine="0" w:firstLineChars="0"/>
+              <w:rPr>
+                <w:rFonts w:ascii="Arial" w:hAnsi="Arial" w:eastAsia="Arial" w:cs="Arial"/>
+                <w:i w:val="false"/>
+                <w:b w:val="false"/>
+                <w:u w:val="none"/>
+                <w:strike w:val="false"/>
+                <w:sz w:val="21"/>
+                <w:szCs w:val="21"/>
+                <w:color w:val="000000"/>
+              </w:rPr>
             </w:pPr>
             <w:r>
               <w:rPr>
-                <w:rFonts w:ascii="Arial" w:hAnsi="DejaVu Sans" w:eastAsia="DejaVu Sans" w:cs="DejaVu Sans"/>
-                <w:i w:val="false"/>
-                <w:b w:val="false"/>
-                <w:u w:val="none"/>
-                <w:sz w:val="21"/>
-                <w:szCs w:val="21"/>
-                <w:color w:val="000000"/>
-              </w:rPr>
-              <w:t xml:space="preserve">After (round 1) x Enrolled</w:t>
+                <w:rFonts w:ascii="Arial" w:hAnsi="Arial" w:eastAsia="Arial" w:cs="Arial"/>
+                <w:i w:val="false"/>
+                <w:b w:val="false"/>
+                <w:u w:val="none"/>
+                <w:strike w:val="false"/>
+                <w:sz w:val="21"/>
+                <w:szCs w:val="21"/>
+                <w:color w:val="000000"/>
+              </w:rPr>
+              <w:t xml:space="preserve">After x Took part</w:t>
             </w:r>
           </w:p>
         </w:tc>
@@ -2100,7 +2484,6 @@
           </w:tcPr>
           <w:p>
             <w:pPr>
-              <w:pStyle w:val="Normal"/>
               <w:jc w:val="left"/>
               <w:pBdr>
                 <w:bottom w:val="none" w:sz="0" w:space="0" w:color="000000"/>
@@ -2110,18 +2493,29 @@
               </w:pBdr>
               <w:spacing w:after="80" w:before="80" w:line="240"/>
               <w:ind w:left="80" w:right="80" w:firstLine="0" w:firstLineChars="0"/>
+              <w:rPr>
+                <w:rFonts w:ascii="Arial" w:hAnsi="Arial" w:eastAsia="Arial" w:cs="Arial"/>
+                <w:i w:val="false"/>
+                <w:b w:val="false"/>
+                <w:u w:val="none"/>
+                <w:strike w:val="false"/>
+                <w:sz w:val="21"/>
+                <w:szCs w:val="21"/>
+                <w:color w:val="000000"/>
+              </w:rPr>
             </w:pPr>
             <w:r>
               <w:rPr>
-                <w:rFonts w:ascii="Arial" w:hAnsi="DejaVu Sans" w:eastAsia="DejaVu Sans" w:cs="DejaVu Sans"/>
-                <w:i w:val="false"/>
-                <w:b w:val="false"/>
-                <w:u w:val="none"/>
-                <w:sz w:val="21"/>
-                <w:szCs w:val="21"/>
-                <w:color w:val="000000"/>
-              </w:rPr>
-              <w:t xml:space="preserve">-816</w:t>
+                <w:rFonts w:ascii="Arial" w:hAnsi="Arial" w:eastAsia="Arial" w:cs="Arial"/>
+                <w:i w:val="false"/>
+                <w:b w:val="false"/>
+                <w:u w:val="none"/>
+                <w:strike w:val="false"/>
+                <w:sz w:val="21"/>
+                <w:szCs w:val="21"/>
+                <w:color w:val="000000"/>
+              </w:rPr>
+              <w:t xml:space="preserve">-813</w:t>
             </w:r>
           </w:p>
         </w:tc>
@@ -2144,7 +2538,6 @@
           </w:tcPr>
           <w:p>
             <w:pPr>
-              <w:pStyle w:val="Normal"/>
               <w:jc w:val="left"/>
               <w:pBdr>
                 <w:bottom w:val="none" w:sz="0" w:space="0" w:color="000000"/>
@@ -2154,18 +2547,29 @@
               </w:pBdr>
               <w:spacing w:after="80" w:before="80" w:line="240"/>
               <w:ind w:left="80" w:right="80" w:firstLine="0" w:firstLineChars="0"/>
+              <w:rPr>
+                <w:rFonts w:ascii="Arial" w:hAnsi="Arial" w:eastAsia="Arial" w:cs="Arial"/>
+                <w:i w:val="false"/>
+                <w:b w:val="false"/>
+                <w:u w:val="none"/>
+                <w:strike w:val="false"/>
+                <w:sz w:val="21"/>
+                <w:szCs w:val="21"/>
+                <w:color w:val="000000"/>
+              </w:rPr>
             </w:pPr>
             <w:r>
               <w:rPr>
-                <w:rFonts w:ascii="Arial" w:hAnsi="DejaVu Sans" w:eastAsia="DejaVu Sans" w:cs="DejaVu Sans"/>
-                <w:i w:val="false"/>
-                <w:b w:val="false"/>
-                <w:u w:val="none"/>
-                <w:sz w:val="21"/>
-                <w:szCs w:val="21"/>
-                <w:color w:val="000000"/>
-              </w:rPr>
-              <w:t xml:space="preserve">32</w:t>
+                <w:rFonts w:ascii="Arial" w:hAnsi="Arial" w:eastAsia="Arial" w:cs="Arial"/>
+                <w:i w:val="false"/>
+                <w:b w:val="false"/>
+                <w:u w:val="none"/>
+                <w:strike w:val="false"/>
+                <w:sz w:val="21"/>
+                <w:szCs w:val="21"/>
+                <w:color w:val="000000"/>
+              </w:rPr>
+              <w:t xml:space="preserve">10</w:t>
             </w:r>
           </w:p>
         </w:tc>
@@ -2188,7 +2592,6 @@
           </w:tcPr>
           <w:p>
             <w:pPr>
-              <w:pStyle w:val="Normal"/>
               <w:jc w:val="left"/>
               <w:pBdr>
                 <w:bottom w:val="none" w:sz="0" w:space="0" w:color="000000"/>
@@ -2198,13 +2601,24 @@
               </w:pBdr>
               <w:spacing w:after="80" w:before="80" w:line="240"/>
               <w:ind w:left="80" w:right="80" w:firstLine="0" w:firstLineChars="0"/>
+              <w:rPr>
+                <w:rFonts w:ascii="Arial" w:hAnsi="Arial" w:eastAsia="Arial" w:cs="Arial"/>
+                <w:i w:val="false"/>
+                <w:b w:val="false"/>
+                <w:u w:val="none"/>
+                <w:strike w:val="false"/>
+                <w:sz w:val="21"/>
+                <w:szCs w:val="21"/>
+                <w:color w:val="000000"/>
+              </w:rPr>
             </w:pPr>
             <w:r>
               <w:rPr>
-                <w:rFonts w:ascii="Arial" w:hAnsi="DejaVu Sans" w:eastAsia="DejaVu Sans" w:cs="DejaVu Sans"/>
-                <w:i w:val="false"/>
-                <w:b w:val="false"/>
-                <w:u w:val="none"/>
+                <w:rFonts w:ascii="Arial" w:hAnsi="Arial" w:eastAsia="Arial" w:cs="Arial"/>
+                <w:i w:val="false"/>
+                <w:b w:val="false"/>
+                <w:u w:val="none"/>
+                <w:strike w:val="false"/>
                 <w:sz w:val="21"/>
                 <w:szCs w:val="21"/>
                 <w:color w:val="000000"/>
@@ -2232,7 +2646,6 @@
           </w:tcPr>
           <w:p>
             <w:pPr>
-              <w:pStyle w:val="Normal"/>
               <w:jc w:val="left"/>
               <w:pBdr>
                 <w:bottom w:val="none" w:sz="0" w:space="0" w:color="000000"/>
@@ -2242,18 +2655,29 @@
               </w:pBdr>
               <w:spacing w:after="80" w:before="80" w:line="240"/>
               <w:ind w:left="80" w:right="80" w:firstLine="0" w:firstLineChars="0"/>
+              <w:rPr>
+                <w:rFonts w:ascii="Arial" w:hAnsi="Arial" w:eastAsia="Arial" w:cs="Arial"/>
+                <w:i w:val="false"/>
+                <w:b w:val="false"/>
+                <w:u w:val="none"/>
+                <w:strike w:val="false"/>
+                <w:sz w:val="21"/>
+                <w:szCs w:val="21"/>
+                <w:color w:val="000000"/>
+              </w:rPr>
             </w:pPr>
             <w:r>
               <w:rPr>
-                <w:rFonts w:ascii="Arial" w:hAnsi="DejaVu Sans" w:eastAsia="DejaVu Sans" w:cs="DejaVu Sans"/>
-                <w:i w:val="false"/>
-                <w:b w:val="false"/>
-                <w:u w:val="none"/>
-                <w:sz w:val="21"/>
-                <w:szCs w:val="21"/>
-                <w:color w:val="000000"/>
-              </w:rPr>
-              <w:t xml:space="preserve">[-881, -752]</w:t>
+                <w:rFonts w:ascii="Arial" w:hAnsi="Arial" w:eastAsia="Arial" w:cs="Arial"/>
+                <w:i w:val="false"/>
+                <w:b w:val="false"/>
+                <w:u w:val="none"/>
+                <w:strike w:val="false"/>
+                <w:sz w:val="21"/>
+                <w:szCs w:val="21"/>
+                <w:color w:val="000000"/>
+              </w:rPr>
+              <w:t xml:space="preserve">[-834, -793]</w:t>
             </w:r>
           </w:p>
         </w:tc>
@@ -2278,6 +2702,7 @@
           <w:i w:val="false"/>
           <w:b w:val="false"/>
           <w:u w:val="none"/>
+          <w:strike w:val="false"/>
           <w:sz w:val="22"/>
           <w:szCs w:val="22"/>
           <w:color w:val="000000"/>
@@ -2304,6 +2729,7 @@
           <w:i w:val="false"/>
           <w:b w:val="false"/>
           <w:u w:val="none"/>
+          <w:strike w:val="false"/>
           <w:sz w:val="22"/>
           <w:szCs w:val="22"/>
           <w:color w:val="000000"/>
@@ -2330,11 +2756,12 @@
           <w:i w:val="false"/>
           <w:b w:val="false"/>
           <w:u w:val="none"/>
+          <w:strike w:val="false"/>
           <w:sz w:val="22"/>
           <w:szCs w:val="22"/>
           <w:color w:val="000000"/>
         </w:rPr>
-        <w:t xml:space="preserve">After (round 1) measures  __________________      Enrolled measures  __________________</w:t>
+        <w:t xml:space="preserve">After measures  __________________      Took part measures  __________________</w:t>
       </w:r>
     </w:p>
     <w:p>
@@ -2356,6 +2783,7 @@
           <w:i w:val="false"/>
           <w:b w:val="false"/>
           <w:u w:val="none"/>
+          <w:strike w:val="false"/>
           <w:sz w:val="22"/>
           <w:szCs w:val="22"/>
           <w:color w:val="000000"/>
@@ -2382,6 +2810,7 @@
           <w:i w:val="false"/>
           <w:b w:val="false"/>
           <w:u w:val="none"/>
+          <w:strike w:val="false"/>
           <w:sz w:val="22"/>
           <w:szCs w:val="22"/>
           <w:color w:val="000000"/>
@@ -2408,6 +2837,7 @@
           <w:i w:val="false"/>
           <w:b w:val="false"/>
           <w:u w:val="none"/>
+          <w:strike w:val="false"/>
           <w:sz w:val="22"/>
           <w:szCs w:val="22"/>
           <w:color w:val="B5BEC9"/>
@@ -2434,6 +2864,7 @@
           <w:i w:val="false"/>
           <w:b w:val="false"/>
           <w:u w:val="none"/>
+          <w:strike w:val="false"/>
           <w:sz w:val="22"/>
           <w:szCs w:val="22"/>
           <w:color w:val="B5BEC9"/>
@@ -2466,6 +2897,7 @@
           <w:i w:val="false"/>
           <w:b w:val="false"/>
           <w:u w:val="none"/>
+          <w:strike w:val="false"/>
           <w:sz w:val="18"/>
           <w:szCs w:val="18"/>
           <w:color w:val="545860"/>
@@ -2492,6 +2924,7 @@
           <w:i w:val="false"/>
           <w:b w:val="true"/>
           <w:u w:val="none"/>
+          <w:strike w:val="false"/>
           <w:sz w:val="36"/>
           <w:szCs w:val="36"/>
           <w:color w:val="063360"/>
@@ -2518,6 +2951,7 @@
           <w:i w:val="true"/>
           <w:b w:val="false"/>
           <w:u w:val="none"/>
+          <w:strike w:val="false"/>
           <w:sz w:val="18"/>
           <w:szCs w:val="18"/>
           <w:color w:val="215A9E"/>
@@ -2544,6 +2978,7 @@
           <w:i w:val="false"/>
           <w:b w:val="true"/>
           <w:u w:val="none"/>
+          <w:strike w:val="false"/>
           <w:sz w:val="22"/>
           <w:szCs w:val="22"/>
           <w:color w:val="000000"/>
@@ -2570,6 +3005,7 @@
           <w:i w:val="true"/>
           <w:b w:val="false"/>
           <w:u w:val="none"/>
+          <w:strike w:val="false"/>
           <w:sz w:val="22"/>
           <w:szCs w:val="22"/>
           <w:color w:val="000000"/>
@@ -2596,6 +3032,7 @@
           <w:i w:val="false"/>
           <w:b w:val="true"/>
           <w:u w:val="none"/>
+          <w:strike w:val="false"/>
           <w:sz w:val="26"/>
           <w:szCs w:val="26"/>
           <w:color w:val="215A9E"/>
@@ -2622,11 +3059,12 @@
           <w:i w:val="false"/>
           <w:b w:val="false"/>
           <w:u w:val="none"/>
+          <w:strike w:val="false"/>
           <w:sz w:val="22"/>
           <w:szCs w:val="22"/>
           <w:color w:val="000000"/>
         </w:rPr>
-        <w:t xml:space="preserve">The table reports a difference-in-differences estimate. The programme reduced costs by 816 AED, and the effect is highly statistically significant (p &lt; 0.001), so the programme was a success. The confidence interval does not include zero, which confirms the finding is robust.</w:t>
+        <w:t xml:space="preserve">The table reports a difference-in-differences estimate. The programme reduced costs by 813 AED, and the effect is highly statistically significant (p &lt; 0.001), so the programme was a success. The confidence interval does not include zero, which confirms the finding is robust.</w:t>
       </w:r>
     </w:p>
     <w:p>
@@ -2648,6 +3086,7 @@
           <w:i w:val="false"/>
           <w:b w:val="false"/>
           <w:u w:val="none"/>
+          <w:strike w:val="false"/>
           <w:sz w:val="22"/>
           <w:szCs w:val="22"/>
           <w:color w:val="000000"/>
@@ -2674,6 +3113,7 @@
           <w:i w:val="false"/>
           <w:b w:val="true"/>
           <w:u w:val="none"/>
+          <w:strike w:val="false"/>
           <w:sz w:val="22"/>
           <w:szCs w:val="22"/>
           <w:color w:val="000000"/>
@@ -2700,6 +3140,7 @@
           <w:i w:val="false"/>
           <w:b w:val="false"/>
           <w:u w:val="none"/>
+          <w:strike w:val="false"/>
           <w:sz w:val="22"/>
           <w:szCs w:val="22"/>
           <w:color w:val="B5BEC9"/>
@@ -2726,6 +3167,7 @@
           <w:i w:val="false"/>
           <w:b w:val="false"/>
           <w:u w:val="none"/>
+          <w:strike w:val="false"/>
           <w:sz w:val="22"/>
           <w:szCs w:val="22"/>
           <w:color w:val="B5BEC9"/>
@@ -2752,6 +3194,7 @@
           <w:i w:val="false"/>
           <w:b w:val="false"/>
           <w:u w:val="none"/>
+          <w:strike w:val="false"/>
           <w:sz w:val="22"/>
           <w:szCs w:val="22"/>
           <w:color w:val="B5BEC9"/>
@@ -2778,6 +3221,7 @@
           <w:i w:val="false"/>
           <w:b w:val="true"/>
           <w:u w:val="none"/>
+          <w:strike w:val="false"/>
           <w:sz w:val="26"/>
           <w:szCs w:val="26"/>
           <w:color w:val="215A9E"/>
@@ -2804,6 +3248,7 @@
           <w:i w:val="true"/>
           <w:b w:val="false"/>
           <w:u w:val="none"/>
+          <w:strike w:val="false"/>
           <w:sz w:val="22"/>
           <w:szCs w:val="22"/>
           <w:color w:val="000000"/>
@@ -2830,6 +3275,7 @@
           <w:i w:val="false"/>
           <w:b w:val="false"/>
           <w:u w:val="none"/>
+          <w:strike w:val="false"/>
           <w:sz w:val="22"/>
           <w:szCs w:val="22"/>
           <w:color w:val="000000"/>
@@ -2856,6 +3302,7 @@
           <w:i w:val="false"/>
           <w:b w:val="true"/>
           <w:u w:val="none"/>
+          <w:strike w:val="false"/>
           <w:sz w:val="26"/>
           <w:szCs w:val="26"/>
           <w:color w:val="215A9E"/>
@@ -2882,11 +3329,12 @@
           <w:i w:val="true"/>
           <w:b w:val="false"/>
           <w:u w:val="none"/>
+          <w:strike w:val="false"/>
           <w:sz w:val="22"/>
           <w:szCs w:val="22"/>
           <w:color w:val="000000"/>
         </w:rPr>
-        <w:t xml:space="preserve">"Our DiD shows an 816 AED cut in costs (p&lt;0.001). Write two sentences for the minister recommending scale-up."</w:t>
+        <w:t xml:space="preserve">"Our DiD shows an 813 AED cut in costs (p&lt;0.001). Write two sentences for the minister recommending scale-up."</w:t>
       </w:r>
     </w:p>
     <w:p>
@@ -2908,6 +3356,7 @@
           <w:i w:val="false"/>
           <w:b w:val="false"/>
           <w:u w:val="none"/>
+          <w:strike w:val="false"/>
           <w:sz w:val="22"/>
           <w:szCs w:val="22"/>
           <w:color w:val="000000"/>
@@ -2940,6 +3389,7 @@
           <w:i w:val="false"/>
           <w:b w:val="false"/>
           <w:u w:val="none"/>
+          <w:strike w:val="false"/>
           <w:sz w:val="18"/>
           <w:szCs w:val="18"/>
           <w:color w:val="545860"/>
@@ -2966,6 +3416,7 @@
           <w:i w:val="false"/>
           <w:b w:val="true"/>
           <w:u w:val="none"/>
+          <w:strike w:val="false"/>
           <w:sz w:val="36"/>
           <w:szCs w:val="36"/>
           <w:color w:val="063360"/>
@@ -2992,6 +3443,7 @@
           <w:i w:val="true"/>
           <w:b w:val="false"/>
           <w:u w:val="none"/>
+          <w:strike w:val="false"/>
           <w:sz w:val="18"/>
           <w:szCs w:val="18"/>
           <w:color w:val="215A9E"/>
@@ -3033,7 +3485,6 @@
           </w:tcPr>
           <w:p>
             <w:pPr>
-              <w:pStyle w:val="Normal"/>
               <w:jc w:val="left"/>
               <w:pBdr>
                 <w:bottom w:val="none" w:sz="0" w:space="0" w:color="000000"/>
@@ -3043,6 +3494,16 @@
               </w:pBdr>
               <w:spacing w:after="200" w:before="200" w:line="240"/>
               <w:ind w:left="200" w:right="200" w:firstLine="0" w:firstLineChars="0"/>
+              <w:rPr>
+                <w:rFonts w:ascii="Arial" w:hAnsi="Arial" w:eastAsia="Arial" w:cs="Arial"/>
+                <w:i w:val="false"/>
+                <w:b w:val="false"/>
+                <w:u w:val="none"/>
+                <w:strike w:val="false"/>
+                <w:sz w:val="21"/>
+                <w:szCs w:val="21"/>
+                <w:color w:val="000000"/>
+              </w:rPr>
             </w:pPr>
             <w:r>
               <w:rPr>
@@ -3050,6 +3511,7 @@
                 <w:i w:val="false"/>
                 <w:b w:val="true"/>
                 <w:u w:val="none"/>
+                <w:strike w:val="false"/>
                 <w:sz w:val="22"/>
                 <w:szCs w:val="22"/>
                 <w:color w:val="063360"/>
@@ -3062,6 +3524,7 @@
                 <w:i w:val="false"/>
                 <w:b w:val="false"/>
                 <w:u w:val="none"/>
+                <w:strike w:val="false"/>
                 <w:sz w:val="21"/>
                 <w:szCs w:val="21"/>
                 <w:color w:val="000000"/>
@@ -3074,6 +3537,7 @@
                 <w:i w:val="false"/>
                 <w:b w:val="false"/>
                 <w:u w:val="none"/>
+                <w:strike w:val="false"/>
                 <w:sz w:val="21"/>
                 <w:szCs w:val="21"/>
                 <w:color w:val="000000"/>
@@ -3086,6 +3550,7 @@
                 <w:i w:val="false"/>
                 <w:b w:val="false"/>
                 <w:u w:val="none"/>
+                <w:strike w:val="false"/>
                 <w:sz w:val="21"/>
                 <w:szCs w:val="21"/>
                 <w:color w:val="000000"/>
@@ -3098,6 +3563,7 @@
                 <w:i w:val="false"/>
                 <w:b w:val="false"/>
                 <w:u w:val="none"/>
+                <w:strike w:val="false"/>
                 <w:sz w:val="21"/>
                 <w:szCs w:val="21"/>
                 <w:color w:val="000000"/>
@@ -3110,6 +3576,7 @@
                 <w:i w:val="false"/>
                 <w:b w:val="false"/>
                 <w:u w:val="none"/>
+                <w:strike w:val="false"/>
                 <w:sz w:val="21"/>
                 <w:szCs w:val="21"/>
                 <w:color w:val="000000"/>
@@ -3122,6 +3589,7 @@
                 <w:i w:val="false"/>
                 <w:b w:val="false"/>
                 <w:u w:val="none"/>
+                <w:strike w:val="false"/>
                 <w:sz w:val="21"/>
                 <w:szCs w:val="21"/>
                 <w:color w:val="000000"/>
@@ -3134,6 +3602,7 @@
                 <w:i w:val="false"/>
                 <w:b w:val="false"/>
                 <w:u w:val="none"/>
+                <w:strike w:val="false"/>
                 <w:sz w:val="21"/>
                 <w:szCs w:val="21"/>
                 <w:color w:val="000000"/>
@@ -3146,6 +3615,7 @@
                 <w:i w:val="false"/>
                 <w:b w:val="false"/>
                 <w:u w:val="none"/>
+                <w:strike w:val="false"/>
                 <w:sz w:val="21"/>
                 <w:szCs w:val="21"/>
                 <w:color w:val="000000"/>
@@ -3158,6 +3628,7 @@
                 <w:i w:val="false"/>
                 <w:b w:val="false"/>
                 <w:u w:val="none"/>
+                <w:strike w:val="false"/>
                 <w:sz w:val="21"/>
                 <w:szCs w:val="21"/>
                 <w:color w:val="000000"/>
@@ -3170,6 +3641,7 @@
                 <w:i w:val="false"/>
                 <w:b w:val="false"/>
                 <w:u w:val="none"/>
+                <w:strike w:val="false"/>
                 <w:sz w:val="21"/>
                 <w:szCs w:val="21"/>
                 <w:color w:val="000000"/>
@@ -3182,6 +3654,7 @@
                 <w:i w:val="false"/>
                 <w:b w:val="false"/>
                 <w:u w:val="none"/>
+                <w:strike w:val="false"/>
                 <w:sz w:val="21"/>
                 <w:szCs w:val="21"/>
                 <w:color w:val="000000"/>
@@ -3209,7 +3682,6 @@
           </w:tcPr>
           <w:p>
             <w:pPr>
-              <w:pStyle w:val="Normal"/>
               <w:jc w:val="left"/>
               <w:pBdr>
                 <w:bottom w:val="none" w:sz="0" w:space="0" w:color="000000"/>
@@ -3219,6 +3691,16 @@
               </w:pBdr>
               <w:spacing w:after="200" w:before="200" w:line="240"/>
               <w:ind w:left="200" w:right="200" w:firstLine="0" w:firstLineChars="0"/>
+              <w:rPr>
+                <w:rFonts w:ascii="Arial" w:hAnsi="Arial" w:eastAsia="Arial" w:cs="Arial"/>
+                <w:i w:val="false"/>
+                <w:b w:val="false"/>
+                <w:u w:val="none"/>
+                <w:strike w:val="false"/>
+                <w:sz w:val="21"/>
+                <w:szCs w:val="21"/>
+                <w:color w:val="000000"/>
+              </w:rPr>
             </w:pPr>
             <w:r>
               <w:rPr>
@@ -3226,6 +3708,7 @@
                 <w:i w:val="false"/>
                 <w:b w:val="true"/>
                 <w:u w:val="none"/>
+                <w:strike w:val="false"/>
                 <w:sz w:val="22"/>
                 <w:szCs w:val="22"/>
                 <w:color w:val="063360"/>
@@ -3238,6 +3721,7 @@
                 <w:i w:val="false"/>
                 <w:b w:val="false"/>
                 <w:u w:val="none"/>
+                <w:strike w:val="false"/>
                 <w:sz w:val="21"/>
                 <w:szCs w:val="21"/>
                 <w:color w:val="000000"/>
@@ -3250,6 +3734,7 @@
                 <w:i w:val="false"/>
                 <w:b w:val="false"/>
                 <w:u w:val="none"/>
+                <w:strike w:val="false"/>
                 <w:sz w:val="21"/>
                 <w:szCs w:val="21"/>
                 <w:color w:val="000000"/>
@@ -3262,6 +3747,7 @@
                 <w:i w:val="false"/>
                 <w:b w:val="false"/>
                 <w:u w:val="none"/>
+                <w:strike w:val="false"/>
                 <w:sz w:val="21"/>
                 <w:szCs w:val="21"/>
                 <w:color w:val="000000"/>
@@ -3274,6 +3760,7 @@
                 <w:i w:val="false"/>
                 <w:b w:val="false"/>
                 <w:u w:val="none"/>
+                <w:strike w:val="false"/>
                 <w:sz w:val="21"/>
                 <w:szCs w:val="21"/>
                 <w:color w:val="000000"/>
@@ -3286,6 +3773,7 @@
                 <w:i w:val="false"/>
                 <w:b w:val="false"/>
                 <w:u w:val="none"/>
+                <w:strike w:val="false"/>
                 <w:sz w:val="21"/>
                 <w:szCs w:val="21"/>
                 <w:color w:val="000000"/>
@@ -3298,6 +3786,7 @@
                 <w:i w:val="false"/>
                 <w:b w:val="false"/>
                 <w:u w:val="none"/>
+                <w:strike w:val="false"/>
                 <w:sz w:val="21"/>
                 <w:szCs w:val="21"/>
                 <w:color w:val="000000"/>
@@ -3310,6 +3799,7 @@
                 <w:i w:val="false"/>
                 <w:b w:val="false"/>
                 <w:u w:val="none"/>
+                <w:strike w:val="false"/>
                 <w:sz w:val="21"/>
                 <w:szCs w:val="21"/>
                 <w:color w:val="000000"/>
@@ -3322,6 +3812,7 @@
                 <w:i w:val="false"/>
                 <w:b w:val="false"/>
                 <w:u w:val="none"/>
+                <w:strike w:val="false"/>
                 <w:sz w:val="21"/>
                 <w:szCs w:val="21"/>
                 <w:color w:val="000000"/>
@@ -3334,6 +3825,7 @@
                 <w:i w:val="false"/>
                 <w:b w:val="false"/>
                 <w:u w:val="none"/>
+                <w:strike w:val="false"/>
                 <w:sz w:val="21"/>
                 <w:szCs w:val="21"/>
                 <w:color w:val="000000"/>
@@ -3346,6 +3838,7 @@
                 <w:i w:val="false"/>
                 <w:b w:val="false"/>
                 <w:u w:val="none"/>
+                <w:strike w:val="false"/>
                 <w:sz w:val="21"/>
                 <w:szCs w:val="21"/>
                 <w:color w:val="000000"/>
@@ -3358,6 +3851,7 @@
                 <w:i w:val="false"/>
                 <w:b w:val="false"/>
                 <w:u w:val="none"/>
+                <w:strike w:val="false"/>
                 <w:sz w:val="21"/>
                 <w:szCs w:val="21"/>
                 <w:color w:val="000000"/>
@@ -3391,7 +3885,6 @@
           </w:tcPr>
           <w:p>
             <w:pPr>
-              <w:pStyle w:val="Normal"/>
               <w:jc w:val="left"/>
               <w:pBdr>
                 <w:bottom w:val="none" w:sz="0" w:space="0" w:color="000000"/>
@@ -3401,6 +3894,16 @@
               </w:pBdr>
               <w:spacing w:after="200" w:before="200" w:line="240"/>
               <w:ind w:left="200" w:right="200" w:firstLine="0" w:firstLineChars="0"/>
+              <w:rPr>
+                <w:rFonts w:ascii="Arial" w:hAnsi="Arial" w:eastAsia="Arial" w:cs="Arial"/>
+                <w:i w:val="false"/>
+                <w:b w:val="false"/>
+                <w:u w:val="none"/>
+                <w:strike w:val="false"/>
+                <w:sz w:val="21"/>
+                <w:szCs w:val="21"/>
+                <w:color w:val="000000"/>
+              </w:rPr>
             </w:pPr>
             <w:r>
               <w:rPr>
@@ -3408,6 +3911,7 @@
                 <w:i w:val="false"/>
                 <w:b w:val="true"/>
                 <w:u w:val="none"/>
+                <w:strike w:val="false"/>
                 <w:sz w:val="22"/>
                 <w:szCs w:val="22"/>
                 <w:color w:val="063360"/>
@@ -3420,6 +3924,7 @@
                 <w:i w:val="false"/>
                 <w:b w:val="false"/>
                 <w:u w:val="none"/>
+                <w:strike w:val="false"/>
                 <w:sz w:val="21"/>
                 <w:szCs w:val="21"/>
                 <w:color w:val="000000"/>
@@ -3432,6 +3937,7 @@
                 <w:i w:val="false"/>
                 <w:b w:val="false"/>
                 <w:u w:val="none"/>
+                <w:strike w:val="false"/>
                 <w:sz w:val="21"/>
                 <w:szCs w:val="21"/>
                 <w:color w:val="000000"/>
@@ -3444,6 +3950,7 @@
                 <w:i w:val="false"/>
                 <w:b w:val="false"/>
                 <w:u w:val="none"/>
+                <w:strike w:val="false"/>
                 <w:sz w:val="21"/>
                 <w:szCs w:val="21"/>
                 <w:color w:val="000000"/>
@@ -3456,6 +3963,7 @@
                 <w:i w:val="false"/>
                 <w:b w:val="false"/>
                 <w:u w:val="none"/>
+                <w:strike w:val="false"/>
                 <w:sz w:val="21"/>
                 <w:szCs w:val="21"/>
                 <w:color w:val="000000"/>
@@ -3468,6 +3976,7 @@
                 <w:i w:val="false"/>
                 <w:b w:val="false"/>
                 <w:u w:val="none"/>
+                <w:strike w:val="false"/>
                 <w:sz w:val="21"/>
                 <w:szCs w:val="21"/>
                 <w:color w:val="000000"/>
@@ -3480,6 +3989,7 @@
                 <w:i w:val="false"/>
                 <w:b w:val="false"/>
                 <w:u w:val="none"/>
+                <w:strike w:val="false"/>
                 <w:sz w:val="21"/>
                 <w:szCs w:val="21"/>
                 <w:color w:val="000000"/>
@@ -3492,6 +4002,7 @@
                 <w:i w:val="false"/>
                 <w:b w:val="false"/>
                 <w:u w:val="none"/>
+                <w:strike w:val="false"/>
                 <w:sz w:val="21"/>
                 <w:szCs w:val="21"/>
                 <w:color w:val="000000"/>
@@ -3504,6 +4015,7 @@
                 <w:i w:val="false"/>
                 <w:b w:val="false"/>
                 <w:u w:val="none"/>
+                <w:strike w:val="false"/>
                 <w:sz w:val="21"/>
                 <w:szCs w:val="21"/>
                 <w:color w:val="000000"/>
@@ -3516,6 +4028,7 @@
                 <w:i w:val="false"/>
                 <w:b w:val="false"/>
                 <w:u w:val="none"/>
+                <w:strike w:val="false"/>
                 <w:sz w:val="21"/>
                 <w:szCs w:val="21"/>
                 <w:color w:val="000000"/>
@@ -3528,6 +4041,7 @@
                 <w:i w:val="false"/>
                 <w:b w:val="false"/>
                 <w:u w:val="none"/>
+                <w:strike w:val="false"/>
                 <w:sz w:val="21"/>
                 <w:szCs w:val="21"/>
                 <w:color w:val="000000"/>
@@ -3540,6 +4054,7 @@
                 <w:i w:val="false"/>
                 <w:b w:val="false"/>
                 <w:u w:val="none"/>
+                <w:strike w:val="false"/>
                 <w:sz w:val="21"/>
                 <w:szCs w:val="21"/>
                 <w:color w:val="000000"/>
@@ -3567,7 +4082,6 @@
           </w:tcPr>
           <w:p>
             <w:pPr>
-              <w:pStyle w:val="Normal"/>
               <w:jc w:val="left"/>
               <w:pBdr>
                 <w:bottom w:val="none" w:sz="0" w:space="0" w:color="000000"/>
@@ -3577,6 +4091,16 @@
               </w:pBdr>
               <w:spacing w:after="200" w:before="200" w:line="240"/>
               <w:ind w:left="200" w:right="200" w:firstLine="0" w:firstLineChars="0"/>
+              <w:rPr>
+                <w:rFonts w:ascii="Arial" w:hAnsi="Arial" w:eastAsia="Arial" w:cs="Arial"/>
+                <w:i w:val="false"/>
+                <w:b w:val="false"/>
+                <w:u w:val="none"/>
+                <w:strike w:val="false"/>
+                <w:sz w:val="21"/>
+                <w:szCs w:val="21"/>
+                <w:color w:val="000000"/>
+              </w:rPr>
             </w:pPr>
             <w:r>
               <w:rPr>
@@ -3584,6 +4108,7 @@
                 <w:i w:val="false"/>
                 <w:b w:val="true"/>
                 <w:u w:val="none"/>
+                <w:strike w:val="false"/>
                 <w:sz w:val="22"/>
                 <w:szCs w:val="22"/>
                 <w:color w:val="063360"/>
@@ -3596,6 +4121,7 @@
                 <w:i w:val="false"/>
                 <w:b w:val="false"/>
                 <w:u w:val="none"/>
+                <w:strike w:val="false"/>
                 <w:sz w:val="21"/>
                 <w:szCs w:val="21"/>
                 <w:color w:val="000000"/>
@@ -3608,6 +4134,7 @@
                 <w:i w:val="false"/>
                 <w:b w:val="false"/>
                 <w:u w:val="none"/>
+                <w:strike w:val="false"/>
                 <w:sz w:val="21"/>
                 <w:szCs w:val="21"/>
                 <w:color w:val="000000"/>
@@ -3620,6 +4147,7 @@
                 <w:i w:val="false"/>
                 <w:b w:val="false"/>
                 <w:u w:val="none"/>
+                <w:strike w:val="false"/>
                 <w:sz w:val="21"/>
                 <w:szCs w:val="21"/>
                 <w:color w:val="000000"/>
@@ -3632,6 +4160,7 @@
                 <w:i w:val="false"/>
                 <w:b w:val="false"/>
                 <w:u w:val="none"/>
+                <w:strike w:val="false"/>
                 <w:sz w:val="21"/>
                 <w:szCs w:val="21"/>
                 <w:color w:val="000000"/>
@@ -3644,6 +4173,7 @@
                 <w:i w:val="false"/>
                 <w:b w:val="false"/>
                 <w:u w:val="none"/>
+                <w:strike w:val="false"/>
                 <w:sz w:val="21"/>
                 <w:szCs w:val="21"/>
                 <w:color w:val="000000"/>
@@ -3656,6 +4186,7 @@
                 <w:i w:val="false"/>
                 <w:b w:val="false"/>
                 <w:u w:val="none"/>
+                <w:strike w:val="false"/>
                 <w:sz w:val="21"/>
                 <w:szCs w:val="21"/>
                 <w:color w:val="000000"/>
@@ -3668,6 +4199,7 @@
                 <w:i w:val="false"/>
                 <w:b w:val="false"/>
                 <w:u w:val="none"/>
+                <w:strike w:val="false"/>
                 <w:sz w:val="21"/>
                 <w:szCs w:val="21"/>
                 <w:color w:val="000000"/>
@@ -3680,6 +4212,7 @@
                 <w:i w:val="false"/>
                 <w:b w:val="false"/>
                 <w:u w:val="none"/>
+                <w:strike w:val="false"/>
                 <w:sz w:val="21"/>
                 <w:szCs w:val="21"/>
                 <w:color w:val="000000"/>
@@ -3692,6 +4225,7 @@
                 <w:i w:val="false"/>
                 <w:b w:val="false"/>
                 <w:u w:val="none"/>
+                <w:strike w:val="false"/>
                 <w:sz w:val="21"/>
                 <w:szCs w:val="21"/>
                 <w:color w:val="000000"/>
@@ -3704,6 +4238,7 @@
                 <w:i w:val="false"/>
                 <w:b w:val="false"/>
                 <w:u w:val="none"/>
+                <w:strike w:val="false"/>
                 <w:sz w:val="21"/>
                 <w:szCs w:val="21"/>
                 <w:color w:val="000000"/>
@@ -3716,6 +4251,7 @@
                 <w:i w:val="false"/>
                 <w:b w:val="false"/>
                 <w:u w:val="none"/>
+                <w:strike w:val="false"/>
                 <w:sz w:val="21"/>
                 <w:szCs w:val="21"/>
                 <w:color w:val="000000"/>
@@ -3749,7 +4285,6 @@
           </w:tcPr>
           <w:p>
             <w:pPr>
-              <w:pStyle w:val="Normal"/>
               <w:jc w:val="left"/>
               <w:pBdr>
                 <w:bottom w:val="none" w:sz="0" w:space="0" w:color="000000"/>
@@ -3759,6 +4294,16 @@
               </w:pBdr>
               <w:spacing w:after="200" w:before="200" w:line="240"/>
               <w:ind w:left="200" w:right="200" w:firstLine="0" w:firstLineChars="0"/>
+              <w:rPr>
+                <w:rFonts w:ascii="Arial" w:hAnsi="Arial" w:eastAsia="Arial" w:cs="Arial"/>
+                <w:i w:val="false"/>
+                <w:b w:val="false"/>
+                <w:u w:val="none"/>
+                <w:strike w:val="false"/>
+                <w:sz w:val="21"/>
+                <w:szCs w:val="21"/>
+                <w:color w:val="000000"/>
+              </w:rPr>
             </w:pPr>
             <w:r>
               <w:rPr>
@@ -3766,6 +4311,7 @@
                 <w:i w:val="false"/>
                 <w:b w:val="true"/>
                 <w:u w:val="none"/>
+                <w:strike w:val="false"/>
                 <w:sz w:val="22"/>
                 <w:szCs w:val="22"/>
                 <w:color w:val="063360"/>
@@ -3778,6 +4324,7 @@
                 <w:i w:val="false"/>
                 <w:b w:val="false"/>
                 <w:u w:val="none"/>
+                <w:strike w:val="false"/>
                 <w:sz w:val="21"/>
                 <w:szCs w:val="21"/>
                 <w:color w:val="000000"/>
@@ -3790,6 +4337,7 @@
                 <w:i w:val="false"/>
                 <w:b w:val="false"/>
                 <w:u w:val="none"/>
+                <w:strike w:val="false"/>
                 <w:sz w:val="21"/>
                 <w:szCs w:val="21"/>
                 <w:color w:val="000000"/>
@@ -3802,6 +4350,7 @@
                 <w:i w:val="false"/>
                 <w:b w:val="false"/>
                 <w:u w:val="none"/>
+                <w:strike w:val="false"/>
                 <w:sz w:val="21"/>
                 <w:szCs w:val="21"/>
                 <w:color w:val="000000"/>
@@ -3814,6 +4363,7 @@
                 <w:i w:val="false"/>
                 <w:b w:val="false"/>
                 <w:u w:val="none"/>
+                <w:strike w:val="false"/>
                 <w:sz w:val="21"/>
                 <w:szCs w:val="21"/>
                 <w:color w:val="000000"/>
@@ -3826,6 +4376,7 @@
                 <w:i w:val="false"/>
                 <w:b w:val="false"/>
                 <w:u w:val="none"/>
+                <w:strike w:val="false"/>
                 <w:sz w:val="21"/>
                 <w:szCs w:val="21"/>
                 <w:color w:val="000000"/>
@@ -3838,6 +4389,7 @@
                 <w:i w:val="false"/>
                 <w:b w:val="false"/>
                 <w:u w:val="none"/>
+                <w:strike w:val="false"/>
                 <w:sz w:val="21"/>
                 <w:szCs w:val="21"/>
                 <w:color w:val="000000"/>
@@ -3850,6 +4402,7 @@
                 <w:i w:val="false"/>
                 <w:b w:val="false"/>
                 <w:u w:val="none"/>
+                <w:strike w:val="false"/>
                 <w:sz w:val="21"/>
                 <w:szCs w:val="21"/>
                 <w:color w:val="000000"/>
@@ -3862,6 +4415,7 @@
                 <w:i w:val="false"/>
                 <w:b w:val="false"/>
                 <w:u w:val="none"/>
+                <w:strike w:val="false"/>
                 <w:sz w:val="21"/>
                 <w:szCs w:val="21"/>
                 <w:color w:val="000000"/>
@@ -3874,6 +4428,7 @@
                 <w:i w:val="false"/>
                 <w:b w:val="false"/>
                 <w:u w:val="none"/>
+                <w:strike w:val="false"/>
                 <w:sz w:val="21"/>
                 <w:szCs w:val="21"/>
                 <w:color w:val="000000"/>
@@ -3886,6 +4441,7 @@
                 <w:i w:val="false"/>
                 <w:b w:val="false"/>
                 <w:u w:val="none"/>
+                <w:strike w:val="false"/>
                 <w:sz w:val="21"/>
                 <w:szCs w:val="21"/>
                 <w:color w:val="000000"/>
@@ -3898,6 +4454,7 @@
                 <w:i w:val="false"/>
                 <w:b w:val="false"/>
                 <w:u w:val="none"/>
+                <w:strike w:val="false"/>
                 <w:sz w:val="21"/>
                 <w:szCs w:val="21"/>
                 <w:color w:val="000000"/>
@@ -3925,7 +4482,6 @@
           </w:tcPr>
           <w:p>
             <w:pPr>
-              <w:pStyle w:val="Normal"/>
               <w:jc w:val="left"/>
               <w:pBdr>
                 <w:bottom w:val="none" w:sz="0" w:space="0" w:color="000000"/>
@@ -3935,6 +4491,16 @@
               </w:pBdr>
               <w:spacing w:after="200" w:before="200" w:line="240"/>
               <w:ind w:left="200" w:right="200" w:firstLine="0" w:firstLineChars="0"/>
+              <w:rPr>
+                <w:rFonts w:ascii="Arial" w:hAnsi="Arial" w:eastAsia="Arial" w:cs="Arial"/>
+                <w:i w:val="false"/>
+                <w:b w:val="false"/>
+                <w:u w:val="none"/>
+                <w:strike w:val="false"/>
+                <w:sz w:val="21"/>
+                <w:szCs w:val="21"/>
+                <w:color w:val="000000"/>
+              </w:rPr>
             </w:pPr>
             <w:r>
               <w:rPr>
@@ -3942,6 +4508,7 @@
                 <w:i w:val="false"/>
                 <w:b w:val="true"/>
                 <w:u w:val="none"/>
+                <w:strike w:val="false"/>
                 <w:sz w:val="22"/>
                 <w:szCs w:val="22"/>
                 <w:color w:val="063360"/>
@@ -3954,6 +4521,7 @@
                 <w:i w:val="false"/>
                 <w:b w:val="false"/>
                 <w:u w:val="none"/>
+                <w:strike w:val="false"/>
                 <w:sz w:val="21"/>
                 <w:szCs w:val="21"/>
                 <w:color w:val="000000"/>
@@ -3966,6 +4534,7 @@
                 <w:i w:val="false"/>
                 <w:b w:val="false"/>
                 <w:u w:val="none"/>
+                <w:strike w:val="false"/>
                 <w:sz w:val="21"/>
                 <w:szCs w:val="21"/>
                 <w:color w:val="000000"/>
@@ -3978,6 +4547,7 @@
                 <w:i w:val="false"/>
                 <w:b w:val="false"/>
                 <w:u w:val="none"/>
+                <w:strike w:val="false"/>
                 <w:sz w:val="21"/>
                 <w:szCs w:val="21"/>
                 <w:color w:val="000000"/>
@@ -3990,6 +4560,7 @@
                 <w:i w:val="false"/>
                 <w:b w:val="false"/>
                 <w:u w:val="none"/>
+                <w:strike w:val="false"/>
                 <w:sz w:val="21"/>
                 <w:szCs w:val="21"/>
                 <w:color w:val="000000"/>
@@ -4002,6 +4573,7 @@
                 <w:i w:val="false"/>
                 <w:b w:val="false"/>
                 <w:u w:val="none"/>
+                <w:strike w:val="false"/>
                 <w:sz w:val="21"/>
                 <w:szCs w:val="21"/>
                 <w:color w:val="000000"/>
@@ -4014,6 +4586,7 @@
                 <w:i w:val="false"/>
                 <w:b w:val="false"/>
                 <w:u w:val="none"/>
+                <w:strike w:val="false"/>
                 <w:sz w:val="21"/>
                 <w:szCs w:val="21"/>
                 <w:color w:val="000000"/>
@@ -4026,6 +4599,7 @@
                 <w:i w:val="false"/>
                 <w:b w:val="false"/>
                 <w:u w:val="none"/>
+                <w:strike w:val="false"/>
                 <w:sz w:val="21"/>
                 <w:szCs w:val="21"/>
                 <w:color w:val="000000"/>
@@ -4038,6 +4612,7 @@
                 <w:i w:val="false"/>
                 <w:b w:val="false"/>
                 <w:u w:val="none"/>
+                <w:strike w:val="false"/>
                 <w:sz w:val="21"/>
                 <w:szCs w:val="21"/>
                 <w:color w:val="000000"/>
@@ -4050,6 +4625,7 @@
                 <w:i w:val="false"/>
                 <w:b w:val="false"/>
                 <w:u w:val="none"/>
+                <w:strike w:val="false"/>
                 <w:sz w:val="21"/>
                 <w:szCs w:val="21"/>
                 <w:color w:val="000000"/>
@@ -4062,6 +4638,7 @@
                 <w:i w:val="false"/>
                 <w:b w:val="false"/>
                 <w:u w:val="none"/>
+                <w:strike w:val="false"/>
                 <w:sz w:val="21"/>
                 <w:szCs w:val="21"/>
                 <w:color w:val="000000"/>
@@ -4074,6 +4651,7 @@
                 <w:i w:val="false"/>
                 <w:b w:val="false"/>
                 <w:u w:val="none"/>
+                <w:strike w:val="false"/>
                 <w:sz w:val="21"/>
                 <w:szCs w:val="21"/>
                 <w:color w:val="000000"/>
@@ -4109,6 +4687,7 @@
           <w:i w:val="false"/>
           <w:b w:val="false"/>
           <w:u w:val="none"/>
+          <w:strike w:val="false"/>
           <w:sz w:val="18"/>
           <w:szCs w:val="18"/>
           <w:color w:val="545860"/>
@@ -4135,6 +4714,7 @@
           <w:i w:val="false"/>
           <w:b w:val="true"/>
           <w:u w:val="none"/>
+          <w:strike w:val="false"/>
           <w:sz w:val="36"/>
           <w:szCs w:val="36"/>
           <w:color w:val="063360"/>
@@ -4161,6 +4741,7 @@
           <w:i w:val="true"/>
           <w:b w:val="false"/>
           <w:u w:val="none"/>
+          <w:strike w:val="false"/>
           <w:sz w:val="18"/>
           <w:szCs w:val="18"/>
           <w:color w:val="215A9E"/>
@@ -4187,6 +4768,7 @@
           <w:i w:val="false"/>
           <w:b w:val="true"/>
           <w:u w:val="none"/>
+          <w:strike w:val="false"/>
           <w:sz w:val="26"/>
           <w:szCs w:val="26"/>
           <w:color w:val="215A9E"/>
@@ -4213,11 +4795,12 @@
           <w:i w:val="false"/>
           <w:b w:val="false"/>
           <w:u w:val="none"/>
+          <w:strike w:val="false"/>
           <w:sz w:val="22"/>
           <w:szCs w:val="22"/>
           <w:color w:val="000000"/>
         </w:rPr>
-        <w:t xml:space="preserve">Took part 1,449 to 784: change -665. Did not take part 2,079 to 2,230: change +151. Difference of the changes: -816 AED. It does not clear 1,000. Watch the sign: the comparison group went up, so the effect is bigger than the 665 fall in the top row.</w:t>
+        <w:t xml:space="preserve">Took part 1,432 to 762: change -670. Did not take part 2,257 to 2,400: change +144. Difference of the changes: -813 AED. It does not clear 1,000. Watch the sign: the comparison group went up, so the effect is bigger than the 670 fall in the top row.</w:t>
       </w:r>
     </w:p>
     <w:p>
@@ -4239,6 +4822,7 @@
           <w:i w:val="false"/>
           <w:b w:val="true"/>
           <w:u w:val="none"/>
+          <w:strike w:val="false"/>
           <w:sz w:val="26"/>
           <w:szCs w:val="26"/>
           <w:color w:val="215A9E"/>
@@ -4265,11 +4849,12 @@
           <w:i w:val="false"/>
           <w:b w:val="false"/>
           <w:u w:val="none"/>
+          <w:strike w:val="false"/>
           <w:sz w:val="22"/>
           <w:szCs w:val="22"/>
           <w:color w:val="000000"/>
         </w:rPr>
-        <w:t xml:space="preserve">1. After (round 1) x Enrolled, -816 AED: the same number as by hand. 2. After (round 1) (151) is the time trend, what happened to everyone; Enrolled (-630) is the baseline gap, how far apart the groups started. Many pick Enrolled because it is large and has the word in it. 3. 752 AED; the interval is -881 to -752, and even its most generous end (881) is short of 1,000. 4. Whether the groups were already moving in parallel: a pre-trend check needs at least two periods before the programme.</w:t>
+        <w:t xml:space="preserve">1. After x Took part, -813 AED: the same number as by hand. 2. After (144) is the time trend, what happened to everyone; Took part (-825) is the baseline gap, how far apart the groups started. Many pick Took part because it is large and has the words in it. 3. 793 AED; the interval is -834 to -793, and even its most generous end (834) is short of 1,000. 4. Whether the groups were already moving in parallel: a pre-trend check needs at least two periods before the programme. In the deck, the pilot's waiting businesses (score 58 or below, no programme) give a partial check: their costs rose 372 AED against 144 for the city businesses that did not take part, so the DiD understates the effect.</w:t>
       </w:r>
     </w:p>
     <w:p>
@@ -4291,6 +4876,7 @@
           <w:i w:val="false"/>
           <w:b w:val="true"/>
           <w:u w:val="none"/>
+          <w:strike w:val="false"/>
           <w:sz w:val="26"/>
           <w:szCs w:val="26"/>
           <w:color w:val="215A9E"/>
@@ -4317,11 +4903,12 @@
           <w:i w:val="false"/>
           <w:b w:val="false"/>
           <w:u w:val="none"/>
+          <w:strike w:val="false"/>
           <w:sz w:val="22"/>
           <w:szCs w:val="22"/>
           <w:color w:val="000000"/>
         </w:rPr>
-        <w:t xml:space="preserve">Supported by the table: the 816 AED estimate and p &lt; 0.001. Not supported: "so the programme was a success" answers whether the effect is non-zero, not whether it clears 1,000. "Does not include zero, which confirms the finding is robust": not zero and big enough are different claims. "The parallel trends assumption has been satisfied" is the serious one: with one period before the programme it cannot be tested, so the model reported a test that was never run. "Clears the 1,000 AED threshold" is false: even the interval's most generous end is 881 AED.</w:t>
+        <w:t xml:space="preserve">Supported by the table: the 813 AED estimate and p &lt; 0.001. Not supported: "so the programme was a success" answers whether the effect is non-zero, not whether it clears 1,000. "Does not include zero, which confirms the finding is robust": not zero and big enough are different claims. "The parallel trends assumption has been satisfied" is the serious one: with one period before the programme it cannot be tested, so the model reported a test that was never run, and the pilot's waiting businesses suggest it fails. "Clears the 1,000 AED threshold" is false: even the interval's most generous end is 834 AED.</w:t>
       </w:r>
     </w:p>
     <w:p>
@@ -4343,6 +4930,7 @@
           <w:i w:val="false"/>
           <w:b w:val="false"/>
           <w:u w:val="none"/>
+          <w:strike w:val="false"/>
           <w:sz w:val="22"/>
           <w:szCs w:val="22"/>
           <w:color w:val="000000"/>
@@ -4350,11 +4938,11 @@
         <w:t xml:space="preserve">With the second prompt, check whether the parallel-trends claim disappears. Supplying the constraint makes the error less likely; it does not rule it out.</w:t>
       </w:r>
     </w:p>
-    <w:sectPr w:officer="true">
-      <w:pgMar w:header="720" w:bottom="1008" w:top="1008" w:right="1152" w:left="1152" w:footer="720" w:gutter="720"/>
+    <w:sectPr>
+      <w:pgMar w:header="708" w:bottom="1008" w:top="1008" w:right="1152" w:left="1152" w:footer="708" w:gutter="0"/>
       <w:pgSz w:h="16838" w:w="11906" w:orient="portrait"/>
+      <w:type w:val="continuous"/>
       <w:cols/>
-      <w:type w:val="continuous"/>
     </w:sectPr>
   </w:body>
 </w:document>

</xml_diff>